<commit_message>
Standardize font size across all flowcharts in The Composition of the Soul
</commit_message>
<xml_diff>
--- a/docs/The_Composition_of_the_Soul_Thomas_Riebl.docx
+++ b/docs/The_Composition_of_the_Soul_Thomas_Riebl.docx
@@ -793,7 +793,7 @@
       <w:r>
         <w:drawing>
           <wp:inline>
-            <wp:extent cx="5334000" cy="585931"/>
+            <wp:extent cx="5334000" cy="2064555"/>
             <wp:effectExtent b="0" l="0" r="0" t="0"/>
             <wp:docPr descr="Diagram 2" title="" id="18" name="Picture"/>
             <a:graphic>
@@ -814,7 +814,7 @@
                   <pic:spPr bwMode="auto">
                     <a:xfrm>
                       <a:off x="0" y="0"/>
-                      <a:ext cx="5334000" cy="585931"/>
+                      <a:ext cx="5334000" cy="2064555"/>
                     </a:xfrm>
                     <a:prstGeom prst="rect">
                       <a:avLst/>
@@ -1591,7 +1591,7 @@
       <w:r>
         <w:drawing>
           <wp:inline>
-            <wp:extent cx="5334000" cy="4997188"/>
+            <wp:extent cx="5334000" cy="3006312"/>
             <wp:effectExtent b="0" l="0" r="0" t="0"/>
             <wp:docPr descr="Diagram 4" title="" id="30" name="Picture"/>
             <a:graphic>
@@ -1612,7 +1612,7 @@
                   <pic:spPr bwMode="auto">
                     <a:xfrm>
                       <a:off x="0" y="0"/>
-                      <a:ext cx="5334000" cy="4997188"/>
+                      <a:ext cx="5334000" cy="3006312"/>
                     </a:xfrm>
                     <a:prstGeom prst="rect">
                       <a:avLst/>
@@ -1805,7 +1805,7 @@
       <w:r>
         <w:drawing>
           <wp:inline>
-            <wp:extent cx="5334000" cy="3531053"/>
+            <wp:extent cx="5334000" cy="670100"/>
             <wp:effectExtent b="0" l="0" r="0" t="0"/>
             <wp:docPr descr="Diagram 5" title="" id="34" name="Picture"/>
             <a:graphic>
@@ -1826,7 +1826,7 @@
                   <pic:spPr bwMode="auto">
                     <a:xfrm>
                       <a:off x="0" y="0"/>
-                      <a:ext cx="5334000" cy="3531053"/>
+                      <a:ext cx="5334000" cy="670100"/>
                     </a:xfrm>
                     <a:prstGeom prst="rect">
                       <a:avLst/>
@@ -3014,7 +3014,7 @@
       <w:r>
         <w:drawing>
           <wp:inline>
-            <wp:extent cx="5334000" cy="5057172"/>
+            <wp:extent cx="5334000" cy="1224745"/>
             <wp:effectExtent b="0" l="0" r="0" t="0"/>
             <wp:docPr descr="Diagram 7" title="" id="42" name="Picture"/>
             <a:graphic>
@@ -3035,7 +3035,7 @@
                   <pic:spPr bwMode="auto">
                     <a:xfrm>
                       <a:off x="0" y="0"/>
-                      <a:ext cx="5334000" cy="5057172"/>
+                      <a:ext cx="5334000" cy="1224745"/>
                     </a:xfrm>
                     <a:prstGeom prst="rect">
                       <a:avLst/>

</xml_diff>

<commit_message>
Standardize all flowcharts to match large Page 2 format
</commit_message>
<xml_diff>
--- a/docs/The_Composition_of_the_Soul_Thomas_Riebl.docx
+++ b/docs/The_Composition_of_the_Soul_Thomas_Riebl.docx
@@ -1805,7 +1805,7 @@
       <w:r>
         <w:drawing>
           <wp:inline>
-            <wp:extent cx="5334000" cy="670100"/>
+            <wp:extent cx="5334000" cy="2214622"/>
             <wp:effectExtent b="0" l="0" r="0" t="0"/>
             <wp:docPr descr="Diagram 5" title="" id="34" name="Picture"/>
             <a:graphic>
@@ -1826,7 +1826,7 @@
                   <pic:spPr bwMode="auto">
                     <a:xfrm>
                       <a:off x="0" y="0"/>
-                      <a:ext cx="5334000" cy="670100"/>
+                      <a:ext cx="5334000" cy="2214622"/>
                     </a:xfrm>
                     <a:prstGeom prst="rect">
                       <a:avLst/>
@@ -2047,271 +2047,286 @@
           <m:jc m:val="center"/>
         </m:oMathParaPr>
         <m:oMath>
-          <m:r>
-            <m:rPr>
-              <m:nor/>
-              <m:sty m:val="p"/>
-            </m:rPr>
-            <m:t>Individual Soul</m:t>
-          </m:r>
-          <m:r>
-            <m:rPr>
-              <m:sty m:val="p"/>
-            </m:rPr>
-            <m:t>=</m:t>
-          </m:r>
-          <m:limLow>
+          <m:eqArr>
             <m:e>
+              <m:r>
+                <m:rPr>
+                  <m:nor/>
+                  <m:sty m:val="p"/>
+                </m:rPr>
+                <m:t>Individual Soul</m:t>
+              </m:r>
+              <m:r>
+                <m:rPr>
+                  <m:sty m:val="p"/>
+                </m:rPr>
+                <m:t>=</m:t>
+              </m:r>
+              <m:r>
+                <m:t> </m:t>
+              </m:r>
+              <m:r>
+                <m:t>&amp;</m:t>
+              </m:r>
               <m:limLow>
                 <m:e>
+                  <m:limLow>
+                    <m:e>
+                      <m:r>
+                        <m:rPr>
+                          <m:nor/>
+                          <m:sty m:val="p"/>
+                        </m:rPr>
+                        <m:t>Mind-at-Large</m:t>
+                      </m:r>
+                    </m:e>
+                    <m:lim>
+                      <m:r>
+                        <m:rPr>
+                          <m:sty m:val="p"/>
+                        </m:rPr>
+                        <m:t>⏟</m:t>
+                      </m:r>
+                    </m:lim>
+                  </m:limLow>
+                </m:e>
+                <m:lim>
                   <m:r>
                     <m:rPr>
                       <m:nor/>
                       <m:sty m:val="p"/>
                     </m:rPr>
-                    <m:t>Mind-at-Large</m:t>
-                  </m:r>
-                </m:e>
-                <m:lim>
-                  <m:r>
-                    <m:rPr>
-                      <m:sty m:val="p"/>
-                    </m:rPr>
-                    <m:t>⏟</m:t>
+                    <m:t>Ontological Ground (TWE)</m:t>
                   </m:r>
                 </m:lim>
               </m:limLow>
-            </m:e>
-            <m:lim>
+              <m:r>
+                <m:t> </m:t>
+              </m:r>
               <m:r>
                 <m:rPr>
-                  <m:nor/>
                   <m:sty m:val="p"/>
                 </m:rPr>
-                <m:t>Ontological Ground (TWE)</m:t>
+                <m:t>∩</m:t>
               </m:r>
-            </m:lim>
-          </m:limLow>
-          <m:r>
-            <m:t> </m:t>
-          </m:r>
-          <m:r>
-            <m:rPr>
-              <m:sty m:val="p"/>
-            </m:rPr>
-            <m:t>∩</m:t>
-          </m:r>
-          <m:r>
-            <m:t> </m:t>
-          </m:r>
-          <m:limLow>
-            <m:e>
+              <m:r>
+                <m:t> </m:t>
+              </m:r>
               <m:limLow>
                 <m:e>
+                  <m:limLow>
+                    <m:e>
+                      <m:r>
+                        <m:rPr>
+                          <m:nor/>
+                          <m:sty m:val="p"/>
+                        </m:rPr>
+                        <m:t>Genetics</m:t>
+                      </m:r>
+                    </m:e>
+                    <m:lim>
+                      <m:r>
+                        <m:rPr>
+                          <m:sty m:val="p"/>
+                        </m:rPr>
+                        <m:t>⏟</m:t>
+                      </m:r>
+                    </m:lim>
+                  </m:limLow>
+                </m:e>
+                <m:lim>
                   <m:r>
                     <m:rPr>
                       <m:nor/>
                       <m:sty m:val="p"/>
                     </m:rPr>
-                    <m:t>Genetics</m:t>
-                  </m:r>
-                </m:e>
-                <m:lim>
-                  <m:r>
-                    <m:rPr>
-                      <m:sty m:val="p"/>
-                    </m:rPr>
-                    <m:t>⏟</m:t>
+                    <m:t>Phylogenetic Prior</m:t>
                   </m:r>
                 </m:lim>
               </m:limLow>
-            </m:e>
-            <m:lim>
+              <m:r>
+                <m:t> </m:t>
+              </m:r>
               <m:r>
                 <m:rPr>
-                  <m:nor/>
                   <m:sty m:val="p"/>
                 </m:rPr>
-                <m:t>Phylogenetic Prior</m:t>
+                <m:t>∩</m:t>
               </m:r>
-            </m:lim>
-          </m:limLow>
-          <m:r>
-            <m:t> </m:t>
-          </m:r>
-          <m:r>
-            <m:rPr>
-              <m:sty m:val="p"/>
-            </m:rPr>
-            <m:t>∩</m:t>
-          </m:r>
-          <m:r>
-            <m:t> </m:t>
-          </m:r>
-          <m:limLow>
-            <m:e>
+              <m:r>
+                <m:t> </m:t>
+              </m:r>
               <m:limLow>
                 <m:e>
+                  <m:limLow>
+                    <m:e>
+                      <m:r>
+                        <m:rPr>
+                          <m:nor/>
+                          <m:sty m:val="p"/>
+                        </m:rPr>
+                        <m:t>Chance &amp;Necessity</m:t>
+                      </m:r>
+                    </m:e>
+                    <m:lim>
+                      <m:r>
+                        <m:rPr>
+                          <m:sty m:val="p"/>
+                        </m:rPr>
+                        <m:t>⏟</m:t>
+                      </m:r>
+                    </m:lim>
+                  </m:limLow>
+                </m:e>
+                <m:lim>
                   <m:r>
                     <m:rPr>
                       <m:nor/>
                       <m:sty m:val="p"/>
                     </m:rPr>
-                    <m:t>Chance &amp;Necessity</m:t>
-                  </m:r>
-                </m:e>
-                <m:lim>
-                  <m:r>
-                    <m:rPr>
-                      <m:sty m:val="p"/>
-                    </m:rPr>
-                    <m:t>⏟</m:t>
+                    <m:t>Molecular Crucible (Monod/Eigen)</m:t>
                   </m:r>
                 </m:lim>
               </m:limLow>
             </m:e>
-            <m:lim>
+            <m:e>
+              <m:r>
+                <m:t>&amp;</m:t>
+              </m:r>
+              <m:r>
+                <m:t> </m:t>
+              </m:r>
               <m:r>
                 <m:rPr>
-                  <m:nor/>
                   <m:sty m:val="p"/>
                 </m:rPr>
-                <m:t>Molecular Crucible (Monod/Eigen)</m:t>
+                <m:t>∩</m:t>
               </m:r>
-            </m:lim>
-          </m:limLow>
-          <m:r>
-            <m:t> </m:t>
-          </m:r>
-          <m:r>
-            <m:rPr>
-              <m:sty m:val="p"/>
-            </m:rPr>
-            <m:t>∩</m:t>
-          </m:r>
-          <m:r>
-            <m:t> </m:t>
-          </m:r>
-          <m:limLow>
-            <m:e>
+              <m:r>
+                <m:t> </m:t>
+              </m:r>
               <m:limLow>
                 <m:e>
+                  <m:limLow>
+                    <m:e>
+                      <m:r>
+                        <m:rPr>
+                          <m:nor/>
+                          <m:sty m:val="p"/>
+                        </m:rPr>
+                        <m:t>Epigenetics</m:t>
+                      </m:r>
+                    </m:e>
+                    <m:lim>
+                      <m:r>
+                        <m:rPr>
+                          <m:sty m:val="p"/>
+                        </m:rPr>
+                        <m:t>⏟</m:t>
+                      </m:r>
+                    </m:lim>
+                  </m:limLow>
+                </m:e>
+                <m:lim>
                   <m:r>
                     <m:rPr>
                       <m:nor/>
                       <m:sty m:val="p"/>
                     </m:rPr>
-                    <m:t>Epigenetics</m:t>
-                  </m:r>
-                </m:e>
-                <m:lim>
-                  <m:r>
-                    <m:rPr>
-                      <m:sty m:val="p"/>
-                    </m:rPr>
-                    <m:t>⏟</m:t>
+                    <m:t>Transgenerational Memory</m:t>
                   </m:r>
                 </m:lim>
               </m:limLow>
-            </m:e>
-            <m:lim>
+              <m:r>
+                <m:t> </m:t>
+              </m:r>
               <m:r>
                 <m:rPr>
-                  <m:nor/>
                   <m:sty m:val="p"/>
                 </m:rPr>
-                <m:t>Transgenerational Memory</m:t>
+                <m:t>∩</m:t>
               </m:r>
-            </m:lim>
-          </m:limLow>
-          <m:r>
-            <m:t> </m:t>
-          </m:r>
-          <m:r>
-            <m:rPr>
-              <m:sty m:val="p"/>
-            </m:rPr>
-            <m:t>∩</m:t>
-          </m:r>
-          <m:r>
-            <m:t> </m:t>
-          </m:r>
-          <m:limLow>
-            <m:e>
+              <m:r>
+                <m:t> </m:t>
+              </m:r>
               <m:limLow>
                 <m:e>
+                  <m:limLow>
+                    <m:e>
+                      <m:r>
+                        <m:rPr>
+                          <m:nor/>
+                          <m:sty m:val="p"/>
+                        </m:rPr>
+                        <m:t>Ontogenesis</m:t>
+                      </m:r>
+                    </m:e>
+                    <m:lim>
+                      <m:r>
+                        <m:rPr>
+                          <m:sty m:val="p"/>
+                        </m:rPr>
+                        <m:t>⏟</m:t>
+                      </m:r>
+                    </m:lim>
+                  </m:limLow>
+                </m:e>
+                <m:lim>
                   <m:r>
                     <m:rPr>
                       <m:nor/>
                       <m:sty m:val="p"/>
                     </m:rPr>
-                    <m:t>Ontogenesis</m:t>
-                  </m:r>
-                </m:e>
-                <m:lim>
-                  <m:r>
-                    <m:rPr>
-                      <m:sty m:val="p"/>
-                    </m:rPr>
-                    <m:t>⏟</m:t>
+                    <m:t>Biographical Learning</m:t>
                   </m:r>
                 </m:lim>
               </m:limLow>
-            </m:e>
-            <m:lim>
+              <m:r>
+                <m:t> </m:t>
+              </m:r>
               <m:r>
                 <m:rPr>
-                  <m:nor/>
                   <m:sty m:val="p"/>
                 </m:rPr>
-                <m:t>Biographical Learning</m:t>
+                <m:t>∩</m:t>
               </m:r>
-            </m:lim>
-          </m:limLow>
-          <m:r>
-            <m:t> </m:t>
-          </m:r>
-          <m:r>
-            <m:rPr>
-              <m:sty m:val="p"/>
-            </m:rPr>
-            <m:t>∩</m:t>
-          </m:r>
-          <m:r>
-            <m:t> </m:t>
-          </m:r>
-          <m:limLow>
-            <m:e>
+              <m:r>
+                <m:t> </m:t>
+              </m:r>
               <m:limLow>
                 <m:e>
+                  <m:limLow>
+                    <m:e>
+                      <m:r>
+                        <m:rPr>
+                          <m:nor/>
+                          <m:sty m:val="p"/>
+                        </m:rPr>
+                        <m:t>PSM</m:t>
+                      </m:r>
+                    </m:e>
+                    <m:lim>
+                      <m:r>
+                        <m:rPr>
+                          <m:sty m:val="p"/>
+                        </m:rPr>
+                        <m:t>⏟</m:t>
+                      </m:r>
+                    </m:lim>
+                  </m:limLow>
+                </m:e>
+                <m:lim>
                   <m:r>
                     <m:rPr>
                       <m:nor/>
                       <m:sty m:val="p"/>
                     </m:rPr>
-                    <m:t>PSM</m:t>
-                  </m:r>
-                </m:e>
-                <m:lim>
-                  <m:r>
-                    <m:rPr>
-                      <m:sty m:val="p"/>
-                    </m:rPr>
-                    <m:t>⏟</m:t>
+                    <m:t>Dissociative Boundary</m:t>
                   </m:r>
                 </m:lim>
               </m:limLow>
             </m:e>
-            <m:lim>
-              <m:r>
-                <m:rPr>
-                  <m:nor/>
-                  <m:sty m:val="p"/>
-                </m:rPr>
-                <m:t>Dissociative Boundary</m:t>
-              </m:r>
-            </m:lim>
-          </m:limLow>
+          </m:eqArr>
         </m:oMath>
       </m:oMathPara>
     </w:p>

</xml_diff>

<commit_message>
Format Macro-Level Summary Table as responsive table for complete A4 fit
</commit_message>
<xml_diff>
--- a/docs/The_Composition_of_the_Soul_Thomas_Riebl.docx
+++ b/docs/The_Composition_of_the_Soul_Thomas_Riebl.docx
@@ -3844,254 +3844,344 @@
         <w:t xml:space="preserve">Macro-Level Summary Table:</w:t>
       </w:r>
     </w:p>
-    <w:p>
-      <w:pPr>
-        <w:pStyle w:val="FirstParagraph"/>
-      </w:pPr>
-      <m:oMathPara>
-        <m:oMathParaPr>
-          <m:jc m:val="center"/>
-        </m:oMathParaPr>
-        <m:oMath>
-          <m:m>
-            <m:mPr>
-              <m:baseJc m:val="center"/>
-              <m:plcHide m:val="on"/>
-              <m:mcs>
-                <m:mc>
-                  <m:mcPr>
-                    <m:mcJc m:val="left"/>
-                    <m:count m:val="1"/>
-                  </m:mcPr>
-                </m:mc>
-                <m:mc>
-                  <m:mcPr>
-                    <m:mcJc m:val="right"/>
-                    <m:count m:val="1"/>
-                  </m:mcPr>
-                </m:mc>
-                <m:mc>
-                  <m:mcPr>
-                    <m:mcJc m:val="left"/>
-                    <m:count m:val="1"/>
-                  </m:mcPr>
-                </m:mc>
-              </m:mcs>
-            </m:mPr>
-            <m:mr>
-              <m:e>
-                <m:r>
-                  <m:rPr>
-                    <m:nor/>
-                    <m:sty m:val="b"/>
-                  </m:rPr>
-                  <m:t>Architectural Layer</m:t>
-                </m:r>
-              </m:e>
-              <m:e>
-                <m:r>
-                  <m:rPr>
-                    <m:nor/>
-                    <m:sty m:val="b"/>
-                  </m:rPr>
-                  <m:t>Weight</m:t>
-                </m:r>
-              </m:e>
-              <m:e>
-                <m:r>
-                  <m:rPr>
-                    <m:nor/>
-                    <m:sty m:val="b"/>
-                  </m:rPr>
-                  <m:t>Ontological Function</m:t>
-                </m:r>
-              </m:e>
-            </m:mr>
-            <m:mr>
-              <m:e>
-                <m:r>
-                  <m:rPr>
-                    <m:nor/>
-                    <m:sty m:val="p"/>
-                  </m:rPr>
-                  <m:t>1. Ontological Ground (Mind-at-Large)</m:t>
-                </m:r>
-              </m:e>
-              <m:e>
-                <m:r>
-                  <m:rPr>
-                    <m:sty m:val="b"/>
-                  </m:rPr>
-                  <m:t>25</m:t>
-                </m:r>
-                <m:r>
-                  <m:rPr>
-                    <m:sty m:val="b"/>
-                  </m:rPr>
-                  <m:t> </m:t>
-                </m:r>
-                <m:r>
-                  <m:rPr>
-                    <m:sty m:val="b"/>
-                  </m:rPr>
-                  <m:t>%</m:t>
-                </m:r>
-              </m:e>
-              <m:e>
-                <m:r>
-                  <m:rPr>
-                    <m:nor/>
-                    <m:sty m:val="p"/>
-                  </m:rPr>
-                  <m:t>The pure, undivided field of conscious awareness</m:t>
-                </m:r>
-              </m:e>
-            </m:mr>
-            <m:mr>
-              <m:e>
-                <m:r>
-                  <m:rPr>
-                    <m:nor/>
-                    <m:sty m:val="p"/>
-                  </m:rPr>
-                  <m:t>2. Biological Embodiment (Genetics + Chance/Eigen + Epigenetics)</m:t>
-                </m:r>
-              </m:e>
-              <m:e>
-                <m:r>
-                  <m:rPr>
-                    <m:sty m:val="b"/>
-                  </m:rPr>
-                  <m:t>40</m:t>
-                </m:r>
-                <m:r>
-                  <m:rPr>
-                    <m:sty m:val="b"/>
-                  </m:rPr>
-                  <m:t> </m:t>
-                </m:r>
-                <m:r>
-                  <m:rPr>
-                    <m:sty m:val="b"/>
-                  </m:rPr>
-                  <m:t>%</m:t>
-                </m:r>
-              </m:e>
-              <m:e>
-                <m:r>
-                  <m:rPr>
-                    <m:nor/>
-                    <m:sty m:val="p"/>
-                  </m:rPr>
-                  <m:t>The physical, thermodynamic, and molecular carrier vessel</m:t>
-                </m:r>
-              </m:e>
-            </m:mr>
-            <m:mr>
-              <m:e>
-                <m:r>
-                  <m:rPr>
-                    <m:nor/>
-                    <m:sty m:val="p"/>
-                  </m:rPr>
-                  <m:t>3. Cognitive Individuation (Lifelong Learning + Ego Tunnel)</m:t>
-                </m:r>
-              </m:e>
-              <m:e>
-                <m:r>
-                  <m:rPr>
-                    <m:sty m:val="b"/>
-                  </m:rPr>
-                  <m:t>35</m:t>
-                </m:r>
-                <m:r>
-                  <m:rPr>
-                    <m:sty m:val="b"/>
-                  </m:rPr>
-                  <m:t> </m:t>
-                </m:r>
-                <m:r>
-                  <m:rPr>
-                    <m:sty m:val="b"/>
-                  </m:rPr>
-                  <m:t>%</m:t>
-                </m:r>
-              </m:e>
-              <m:e>
-                <m:r>
-                  <m:rPr>
-                    <m:nor/>
-                    <m:sty m:val="p"/>
-                  </m:rPr>
-                  <m:t>The psychological, biographical, and narrative individual alter</m:t>
-                </m:r>
-              </m:e>
-            </m:mr>
-            <m:mr>
-              <m:e>
-                <m:r>
-                  <m:rPr>
-                    <m:nor/>
-                    <m:sty m:val="b"/>
-                  </m:rPr>
-                  <m:t>Total Integrated Soul Architecture</m:t>
-                </m:r>
-              </m:e>
-              <m:e>
-                <m:r>
-                  <m:rPr>
-                    <m:sty m:val="b"/>
-                  </m:rPr>
-                  <m:t>100</m:t>
-                </m:r>
-                <m:r>
-                  <m:rPr>
-                    <m:sty m:val="b"/>
-                  </m:rPr>
-                  <m:t> </m:t>
-                </m:r>
-                <m:r>
-                  <m:rPr>
-                    <m:sty m:val="b"/>
-                  </m:rPr>
-                  <m:t>%</m:t>
-                </m:r>
-              </m:e>
-              <m:e>
-                <m:r>
-                  <m:rPr>
-                    <m:nor/>
-                    <m:sty m:val="b"/>
-                  </m:rPr>
-                  <m:t>The autopoietic living alter sustaining integrated causal power </m:t>
-                </m:r>
-                <m:r>
-                  <m:rPr>
-                    <m:sty m:val="p"/>
-                  </m:rPr>
-                  <m:t>(</m:t>
-                </m:r>
-                <m:r>
-                  <m:rPr>
-                    <m:sty m:val="p"/>
-                  </m:rPr>
-                  <m:t>Φ</m:t>
-                </m:r>
-                <m:r>
-                  <m:rPr>
-                    <m:sty m:val="p"/>
-                  </m:rPr>
-                  <m:t>)</m:t>
-                </m:r>
-              </m:e>
-            </m:mr>
-            <m:mr>
-              <m:e/>
-            </m:mr>
-          </m:m>
-        </m:oMath>
-      </m:oMathPara>
-    </w:p>
+    <w:tbl>
+      <w:tblPr>
+        <w:tblStyle w:val="Table"/>
+        <w:tblW w:type="pct" w:w="5000"/>
+        <w:tblLayout w:type="fixed"/>
+        <w:tblLook w:firstRow="1" w:lastRow="0" w:firstColumn="0" w:lastColumn="0" w:noHBand="0" w:noVBand="0" w:val="0020"/>
+      </w:tblPr>
+      <w:tblGrid>
+        <w:gridCol w:w="2436"/>
+        <w:gridCol w:w="3046"/>
+        <w:gridCol w:w="2436"/>
+      </w:tblGrid>
+      <w:tr>
+        <w:trPr>
+          <w:tblHeader w:val="on"/>
+        </w:trPr>
+        <w:tc>
+          <w:tcPr/>
+          <w:p>
+            <w:pPr>
+              <w:pStyle w:val="Compact"/>
+              <w:jc w:val="left"/>
+            </w:pPr>
+            <w:r>
+              <w:t xml:space="preserve">Architectural Layer</w:t>
+            </w:r>
+          </w:p>
+        </w:tc>
+        <w:tc>
+          <w:tcPr/>
+          <w:p>
+            <w:pPr>
+              <w:pStyle w:val="Compact"/>
+              <w:jc w:val="center"/>
+            </w:pPr>
+            <w:r>
+              <w:t xml:space="preserve">Weight</w:t>
+            </w:r>
+          </w:p>
+        </w:tc>
+        <w:tc>
+          <w:tcPr/>
+          <w:p>
+            <w:pPr>
+              <w:pStyle w:val="Compact"/>
+              <w:jc w:val="left"/>
+            </w:pPr>
+            <w:r>
+              <w:t xml:space="preserve">Ontological Function &amp; CIF Mapping</w:t>
+            </w:r>
+          </w:p>
+        </w:tc>
+      </w:tr>
+      <w:tr>
+        <w:tc>
+          <w:tcPr/>
+          <w:p>
+            <w:pPr>
+              <w:pStyle w:val="Compact"/>
+              <w:jc w:val="left"/>
+            </w:pPr>
+            <w:r>
+              <w:rPr>
+                <w:b/>
+                <w:bCs/>
+              </w:rPr>
+              <w:t xml:space="preserve">1. Ontological Ground</w:t>
+            </w:r>
+            <w:r>
+              <w:rPr>
+                <w:i/>
+                <w:iCs/>
+              </w:rPr>
+              <w:t xml:space="preserve">(Mind-at-Large / TWE)</w:t>
+            </w:r>
+          </w:p>
+        </w:tc>
+        <w:tc>
+          <w:tcPr/>
+          <w:p>
+            <w:pPr>
+              <w:pStyle w:val="Compact"/>
+              <w:jc w:val="center"/>
+            </w:pPr>
+            <w:r>
+              <w:rPr>
+                <w:b/>
+                <w:bCs/>
+              </w:rPr>
+              <w:t xml:space="preserve">25 %</w:t>
+            </w:r>
+          </w:p>
+        </w:tc>
+        <w:tc>
+          <w:tcPr/>
+          <w:p>
+            <w:pPr>
+              <w:pStyle w:val="Compact"/>
+              <w:jc w:val="left"/>
+            </w:pPr>
+            <w:r>
+              <w:t xml:space="preserve">The pure, undivided, non-dual field of conscious awareness (Kastrup)</w:t>
+            </w:r>
+          </w:p>
+        </w:tc>
+      </w:tr>
+      <w:tr>
+        <w:tc>
+          <w:tcPr/>
+          <w:p>
+            <w:pPr>
+              <w:pStyle w:val="Compact"/>
+              <w:jc w:val="left"/>
+            </w:pPr>
+            <w:r>
+              <w:rPr>
+                <w:b/>
+                <w:bCs/>
+              </w:rPr>
+              <w:t xml:space="preserve">2. Biological Embodiment</w:t>
+            </w:r>
+            <w:r>
+              <w:rPr>
+                <w:i/>
+                <w:iCs/>
+              </w:rPr>
+              <w:t xml:space="preserve">(Genetics + Chance &amp; Necessity + Epigenetics)</w:t>
+            </w:r>
+          </w:p>
+        </w:tc>
+        <w:tc>
+          <w:tcPr/>
+          <w:p>
+            <w:pPr>
+              <w:pStyle w:val="Compact"/>
+              <w:jc w:val="center"/>
+            </w:pPr>
+            <w:r>
+              <w:rPr>
+                <w:b/>
+                <w:bCs/>
+              </w:rPr>
+              <w:t xml:space="preserve">40 %</w:t>
+            </w:r>
+          </w:p>
+        </w:tc>
+        <w:tc>
+          <w:tcPr/>
+          <w:p>
+            <w:pPr>
+              <w:pStyle w:val="Compact"/>
+              <w:jc w:val="left"/>
+            </w:pPr>
+            <w:r>
+              <w:t xml:space="preserve">The unrepeatable physical carrier vessel: phylogenetic priors (</w:t>
+            </w:r>
+            <m:oMath>
+              <m:sSub>
+                <m:e>
+                  <m:r>
+                    <m:t>D</m:t>
+                  </m:r>
+                </m:e>
+                <m:sub>
+                  <m:r>
+                    <m:t>0</m:t>
+                  </m:r>
+                </m:sub>
+              </m:sSub>
+            </m:oMath>
+            <w:r>
+              <w:t xml:space="preserve">), thermodynamic hypercycles (Monod / Eigen), and transgenerational precision tuning (</w:t>
+            </w:r>
+            <m:oMath>
+              <m:r>
+                <m:t>γ</m:t>
+              </m:r>
+            </m:oMath>
+            <w:r>
+              <w:t xml:space="preserve">)</w:t>
+            </w:r>
+          </w:p>
+        </w:tc>
+      </w:tr>
+      <w:tr>
+        <w:tc>
+          <w:tcPr/>
+          <w:p>
+            <w:pPr>
+              <w:pStyle w:val="Compact"/>
+              <w:jc w:val="left"/>
+            </w:pPr>
+            <w:r>
+              <w:rPr>
+                <w:b/>
+                <w:bCs/>
+              </w:rPr>
+              <w:t xml:space="preserve">3. Cognitive Individuation</w:t>
+            </w:r>
+            <w:r>
+              <w:rPr>
+                <w:i/>
+                <w:iCs/>
+              </w:rPr>
+              <w:t xml:space="preserve">(Lifelong Learning + Ego Tunnel)</w:t>
+            </w:r>
+          </w:p>
+        </w:tc>
+        <w:tc>
+          <w:tcPr/>
+          <w:p>
+            <w:pPr>
+              <w:pStyle w:val="Compact"/>
+              <w:jc w:val="center"/>
+            </w:pPr>
+            <w:r>
+              <w:rPr>
+                <w:b/>
+                <w:bCs/>
+              </w:rPr>
+              <w:t xml:space="preserve">35 %</w:t>
+            </w:r>
+          </w:p>
+        </w:tc>
+        <w:tc>
+          <w:tcPr/>
+          <w:p>
+            <w:pPr>
+              <w:pStyle w:val="Compact"/>
+              <w:jc w:val="left"/>
+            </w:pPr>
+            <w:r>
+              <w:t xml:space="preserve">The psychological, narrative self: autobiographical engrams (</w:t>
+            </w:r>
+            <m:oMath>
+              <m:r>
+                <m:t>A</m:t>
+              </m:r>
+              <m:r>
+                <m:rPr>
+                  <m:sty m:val="p"/>
+                </m:rPr>
+                <m:t>,</m:t>
+              </m:r>
+              <m:r>
+                <m:t>B</m:t>
+              </m:r>
+              <m:r>
+                <m:rPr>
+                  <m:sty m:val="p"/>
+                </m:rPr>
+                <m:t>,</m:t>
+              </m:r>
+              <m:r>
+                <m:t>C</m:t>
+              </m:r>
+            </m:oMath>
+            <w:r>
+              <w:t xml:space="preserve">) and the transparent Phenomenal Self-Model (PSM / Metzinger)</w:t>
+            </w:r>
+          </w:p>
+        </w:tc>
+      </w:tr>
+      <w:tr>
+        <w:tc>
+          <w:tcPr/>
+          <w:p>
+            <w:pPr>
+              <w:pStyle w:val="Compact"/>
+              <w:jc w:val="left"/>
+            </w:pPr>
+            <w:r>
+              <w:rPr>
+                <w:b/>
+                <w:bCs/>
+              </w:rPr>
+              <w:t xml:space="preserve">Total Integrated Soul Architecture</w:t>
+            </w:r>
+          </w:p>
+        </w:tc>
+        <w:tc>
+          <w:tcPr/>
+          <w:p>
+            <w:pPr>
+              <w:pStyle w:val="Compact"/>
+              <w:jc w:val="center"/>
+            </w:pPr>
+            <w:r>
+              <w:rPr>
+                <w:b/>
+                <w:bCs/>
+              </w:rPr>
+              <w:t xml:space="preserve">100 %</w:t>
+            </w:r>
+          </w:p>
+        </w:tc>
+        <w:tc>
+          <w:tcPr/>
+          <w:p>
+            <w:pPr>
+              <w:pStyle w:val="Compact"/>
+              <w:jc w:val="left"/>
+            </w:pPr>
+            <w:r>
+              <w:rPr>
+                <w:b/>
+                <w:bCs/>
+              </w:rPr>
+              <w:t xml:space="preserve">The autopoietic living alter actively sustaining integrated causal power (</w:t>
+            </w:r>
+            <m:oMath>
+              <m:r>
+                <m:rPr>
+                  <m:sty m:val="p"/>
+                </m:rPr>
+                <m:t>Φ</m:t>
+              </m:r>
+              <m:r>
+                <m:rPr>
+                  <m:sty m:val="p"/>
+                </m:rPr>
+                <m:t>&gt;</m:t>
+              </m:r>
+              <m:r>
+                <m:t>0</m:t>
+              </m:r>
+            </m:oMath>
+            <w:r>
+              <w:rPr>
+                <w:b/>
+                <w:bCs/>
+              </w:rPr>
+              <w:t xml:space="preserve">)</w:t>
+            </w:r>
+          </w:p>
+        </w:tc>
+      </w:tr>
+    </w:tbl>
     <w:p>
       <w:r>
         <w:pict>

</xml_diff>

<commit_message>
Add Active Inference & POMDP primer Appendix to The Composition of the Soul
</commit_message>
<xml_diff>
--- a/docs/The_Composition_of_the_Soul_Thomas_Riebl.docx
+++ b/docs/The_Composition_of_the_Soul_Thomas_Riebl.docx
@@ -2,7 +2,7 @@
 <file path=word/document.xml><?xml version="1.0" encoding="utf-8"?>
 <w:document xmlns:w="http://schemas.openxmlformats.org/wordprocessingml/2006/main" xmlns:m="http://schemas.openxmlformats.org/officeDocument/2006/math" xmlns:r="http://schemas.openxmlformats.org/officeDocument/2006/relationships" xmlns:o="urn:schemas-microsoft-com:office:office" xmlns:v="urn:schemas-microsoft-com:vml" xmlns:w10="urn:schemas-microsoft-com:office:word" xmlns:a="http://schemas.openxmlformats.org/drawingml/2006/main" xmlns:pic="http://schemas.openxmlformats.org/drawingml/2006/picture" xmlns:wp="http://schemas.openxmlformats.org/drawingml/2006/wordprocessingDrawing">
   <w:body>
-    <w:bookmarkStart w:id="62" w:name="the-composition-of-the-soul"/>
+    <w:bookmarkStart w:id="71" w:name="the-composition-of-the-soul"/>
     <w:p>
       <w:pPr>
         <w:pStyle w:val="Heading1"/>
@@ -500,12 +500,12 @@
           <w:numId w:val="1001"/>
         </w:numPr>
       </w:pPr>
-      <w:hyperlink w:anchor="Xb8a5eeed3840bf42c96cc3b0a0ad96099f3bfef">
+      <w:hyperlink w:anchor="X1df4311be1c3d5a1b6ce14c626b9b0bbeb02abf">
         <w:r>
           <w:rPr>
             <w:rStyle w:val="Hyperlink"/>
           </w:rPr>
-          <w:t xml:space="preserve">9. References &amp; Academic Bibliography</w:t>
+          <w:t xml:space="preserve">Appendix: Active Inference &amp; Predictive Processing Primer (CIF Context)</w:t>
         </w:r>
       </w:hyperlink>
     </w:p>
@@ -517,12 +517,29 @@
           <w:numId w:val="1001"/>
         </w:numPr>
       </w:pPr>
-      <w:hyperlink w:anchor="X90565c0bb9c74a256ac319d15024665f986d4aa">
+      <w:hyperlink w:anchor="references--academic-bibliography">
         <w:r>
           <w:rPr>
             <w:rStyle w:val="Hyperlink"/>
           </w:rPr>
-          <w:t xml:space="preserve">10. Tool Attribution &amp; Colophon</w:t>
+          <w:t xml:space="preserve">References &amp; Academic Bibliography</w:t>
+        </w:r>
+      </w:hyperlink>
+    </w:p>
+    <w:p>
+      <w:pPr>
+        <w:pStyle w:val="Compact"/>
+        <w:numPr>
+          <w:ilvl w:val="0"/>
+          <w:numId w:val="1001"/>
+        </w:numPr>
+      </w:pPr>
+      <w:hyperlink w:anchor="tool-attribution--colophon">
+        <w:r>
+          <w:rPr>
+            <w:rStyle w:val="Hyperlink"/>
+          </w:rPr>
+          <w:t xml:space="preserve">Tool Attribution &amp; Colophon</w:t>
         </w:r>
       </w:hyperlink>
     </w:p>
@@ -4417,13 +4434,2220 @@
     </w:p>
     <w:bookmarkEnd w:id="54"/>
     <w:bookmarkEnd w:id="55"/>
-    <w:bookmarkStart w:id="56" w:name="references-academic-bibliography"/>
+    <w:bookmarkStart w:id="64" w:name="X0878c06f3872fbdc1926e0c1937deae0a0907d6"/>
     <w:p>
       <w:pPr>
         <w:pStyle w:val="Heading2"/>
       </w:pPr>
       <w:r>
-        <w:t xml:space="preserve">9. References &amp; Academic Bibliography</w:t>
+        <w:t xml:space="preserve">Appendix: Active Inference &amp; Predictive Processing Primer (CIF Context)</w:t>
+      </w:r>
+    </w:p>
+    <w:p>
+      <w:pPr>
+        <w:pStyle w:val="FirstParagraph"/>
+      </w:pPr>
+      <w:r>
+        <w:t xml:space="preserve">To understand how the soul functions as an autopoietic, living cognitive entity without invoking supernatural mechanisms, this treatise relies on the mathematical framework of</w:t>
+      </w:r>
+      <w:r>
+        <w:t xml:space="preserve"> </w:t>
+      </w:r>
+      <w:r>
+        <w:rPr>
+          <w:b/>
+          <w:bCs/>
+        </w:rPr>
+        <w:t xml:space="preserve">Active Inference</w:t>
+      </w:r>
+      <w:r>
+        <w:t xml:space="preserve"> </w:t>
+      </w:r>
+      <w:r>
+        <w:t xml:space="preserve">(Karl Friston) and its discrete-time</w:t>
+      </w:r>
+      <w:r>
+        <w:t xml:space="preserve"> </w:t>
+      </w:r>
+      <w:r>
+        <w:rPr>
+          <w:b/>
+          <w:bCs/>
+        </w:rPr>
+        <w:t xml:space="preserve">Partially Observable Markov Decision Process (POMDP)</w:t>
+      </w:r>
+      <w:r>
+        <w:t xml:space="preserve"> </w:t>
+      </w:r>
+      <w:r>
+        <w:t xml:space="preserve">formulation.</w:t>
+      </w:r>
+    </w:p>
+    <w:p>
+      <w:pPr>
+        <w:pStyle w:val="CaptionedFigure"/>
+      </w:pPr>
+      <w:r>
+        <w:drawing>
+          <wp:inline>
+            <wp:extent cx="5334000" cy="3338788"/>
+            <wp:effectExtent b="0" l="0" r="0" t="0"/>
+            <wp:docPr descr="Diagram 8" title="" id="57" name="Picture"/>
+            <a:graphic>
+              <a:graphicData uri="http://schemas.openxmlformats.org/drawingml/2006/picture">
+                <pic:pic>
+                  <pic:nvPicPr>
+                    <pic:cNvPr descr="/tmp/docx_diagrams_soul/diagram_7.png" id="58" name="Picture"/>
+                    <pic:cNvPicPr>
+                      <a:picLocks noChangeArrowheads="1" noChangeAspect="1"/>
+                    </pic:cNvPicPr>
+                  </pic:nvPicPr>
+                  <pic:blipFill>
+                    <a:blip r:embed="rId56"/>
+                    <a:stretch>
+                      <a:fillRect/>
+                    </a:stretch>
+                  </pic:blipFill>
+                  <pic:spPr bwMode="auto">
+                    <a:xfrm>
+                      <a:off x="0" y="0"/>
+                      <a:ext cx="5334000" cy="3338788"/>
+                    </a:xfrm>
+                    <a:prstGeom prst="rect">
+                      <a:avLst/>
+                    </a:prstGeom>
+                    <a:noFill/>
+                    <a:ln w="9525">
+                      <a:noFill/>
+                      <a:headEnd/>
+                      <a:tailEnd/>
+                    </a:ln>
+                  </pic:spPr>
+                </pic:pic>
+              </a:graphicData>
+            </a:graphic>
+          </wp:inline>
+        </w:drawing>
+      </w:r>
+    </w:p>
+    <w:p>
+      <w:pPr>
+        <w:pStyle w:val="ImageCaption"/>
+      </w:pPr>
+      <w:r>
+        <w:t xml:space="preserve">Diagram 8</w:t>
+      </w:r>
+    </w:p>
+    <w:bookmarkStart w:id="59" w:name="X4fe5b2524eca521de71bedf47604381a9a0f096"/>
+    <w:p>
+      <w:pPr>
+        <w:pStyle w:val="Heading3"/>
+      </w:pPr>
+      <w:r>
+        <w:t xml:space="preserve">1. The Core Principle: Resisting Thermodynamic Decay</w:t>
+      </w:r>
+    </w:p>
+    <w:p>
+      <w:pPr>
+        <w:pStyle w:val="FirstParagraph"/>
+      </w:pPr>
+      <w:r>
+        <w:t xml:space="preserve">In physics, open systems tend toward maximum disorder (entropy). A living organism preserves its existence across time by minimizing</w:t>
+      </w:r>
+      <w:r>
+        <w:t xml:space="preserve"> </w:t>
+      </w:r>
+      <w:r>
+        <w:rPr>
+          <w:b/>
+          <w:bCs/>
+        </w:rPr>
+        <w:t xml:space="preserve">Variational Free Energy (</w:t>
+      </w:r>
+      <m:oMath>
+        <m:r>
+          <m:t>F</m:t>
+        </m:r>
+      </m:oMath>
+      <w:r>
+        <w:rPr>
+          <w:b/>
+          <w:bCs/>
+        </w:rPr>
+        <w:t xml:space="preserve">)</w:t>
+      </w:r>
+      <w:r>
+        <w:t xml:space="preserve">, which acts as an upper mathematical bound on</w:t>
+      </w:r>
+      <w:r>
+        <w:t xml:space="preserve"> </w:t>
+      </w:r>
+      <w:r>
+        <w:rPr>
+          <w:b/>
+          <w:bCs/>
+        </w:rPr>
+        <w:t xml:space="preserve">Sensory Surprise</w:t>
+      </w:r>
+      <w:r>
+        <w:t xml:space="preserve"> </w:t>
+      </w:r>
+      <w:r>
+        <w:t xml:space="preserve">(</w:t>
+      </w:r>
+      <m:oMath>
+        <m:r>
+          <m:rPr>
+            <m:sty m:val="p"/>
+          </m:rPr>
+          <m:t>−</m:t>
+        </m:r>
+        <m:r>
+          <m:rPr>
+            <m:sty m:val="p"/>
+          </m:rPr>
+          <m:t>ln</m:t>
+        </m:r>
+        <m:r>
+          <m:t>p</m:t>
+        </m:r>
+        <m:r>
+          <m:rPr>
+            <m:sty m:val="p"/>
+          </m:rPr>
+          <m:t>(</m:t>
+        </m:r>
+        <m:r>
+          <m:t>o</m:t>
+        </m:r>
+        <m:r>
+          <m:rPr>
+            <m:sty m:val="p"/>
+          </m:rPr>
+          <m:t>)</m:t>
+        </m:r>
+      </m:oMath>
+      <w:r>
+        <w:t xml:space="preserve">):</w:t>
+      </w:r>
+    </w:p>
+    <w:p>
+      <w:pPr>
+        <w:pStyle w:val="BodyText"/>
+      </w:pPr>
+      <m:oMathPara>
+        <m:oMathParaPr>
+          <m:jc m:val="center"/>
+        </m:oMathParaPr>
+        <m:oMath>
+          <m:r>
+            <m:t>F</m:t>
+          </m:r>
+          <m:r>
+            <m:rPr>
+              <m:sty m:val="p"/>
+            </m:rPr>
+            <m:t>=</m:t>
+          </m:r>
+          <m:limLow>
+            <m:e>
+              <m:limLow>
+                <m:e>
+                  <m:sSub>
+                    <m:e>
+                      <m:r>
+                        <m:t>D</m:t>
+                      </m:r>
+                    </m:e>
+                    <m:sub>
+                      <m:r>
+                        <m:rPr>
+                          <m:nor/>
+                          <m:sty m:val="p"/>
+                        </m:rPr>
+                        <m:t>KL</m:t>
+                      </m:r>
+                    </m:sub>
+                  </m:sSub>
+                  <m:d>
+                    <m:dPr>
+                      <m:begChr m:val="["/>
+                      <m:sepChr m:val=""/>
+                      <m:endChr m:val="]"/>
+                      <m:grow/>
+                    </m:dPr>
+                    <m:e>
+                      <m:r>
+                        <m:t>q</m:t>
+                      </m:r>
+                      <m:r>
+                        <m:rPr>
+                          <m:sty m:val="p"/>
+                        </m:rPr>
+                        <m:t>(</m:t>
+                      </m:r>
+                      <m:r>
+                        <m:t>s</m:t>
+                      </m:r>
+                      <m:r>
+                        <m:rPr>
+                          <m:sty m:val="p"/>
+                        </m:rPr>
+                        <m:t>)</m:t>
+                      </m:r>
+                      <m:r>
+                        <m:t> </m:t>
+                      </m:r>
+                      <m:r>
+                        <m:rPr>
+                          <m:sty m:val="p"/>
+                        </m:rPr>
+                        <m:t>∥</m:t>
+                      </m:r>
+                      <m:r>
+                        <m:t> </m:t>
+                      </m:r>
+                      <m:r>
+                        <m:t>p</m:t>
+                      </m:r>
+                      <m:r>
+                        <m:rPr>
+                          <m:sty m:val="p"/>
+                        </m:rPr>
+                        <m:t>(</m:t>
+                      </m:r>
+                      <m:r>
+                        <m:t>s</m:t>
+                      </m:r>
+                      <m:r>
+                        <m:rPr>
+                          <m:sty m:val="p"/>
+                        </m:rPr>
+                        <m:t>∣</m:t>
+                      </m:r>
+                      <m:r>
+                        <m:t>o</m:t>
+                      </m:r>
+                      <m:r>
+                        <m:rPr>
+                          <m:sty m:val="p"/>
+                        </m:rPr>
+                        <m:t>)</m:t>
+                      </m:r>
+                    </m:e>
+                  </m:d>
+                </m:e>
+                <m:lim>
+                  <m:r>
+                    <m:rPr>
+                      <m:sty m:val="p"/>
+                    </m:rPr>
+                    <m:t>⏟</m:t>
+                  </m:r>
+                </m:lim>
+              </m:limLow>
+            </m:e>
+            <m:lim>
+              <m:r>
+                <m:rPr>
+                  <m:nor/>
+                  <m:sty m:val="p"/>
+                </m:rPr>
+                <m:t>Divergence (Perceptual Error)</m:t>
+              </m:r>
+            </m:lim>
+          </m:limLow>
+          <m:r>
+            <m:rPr>
+              <m:sty m:val="p"/>
+            </m:rPr>
+            <m:t>−</m:t>
+          </m:r>
+          <m:limLow>
+            <m:e>
+              <m:limLow>
+                <m:e>
+                  <m:r>
+                    <m:rPr>
+                      <m:sty m:val="p"/>
+                    </m:rPr>
+                    <m:t>ln</m:t>
+                  </m:r>
+                  <m:r>
+                    <m:t>p</m:t>
+                  </m:r>
+                  <m:r>
+                    <m:rPr>
+                      <m:sty m:val="p"/>
+                    </m:rPr>
+                    <m:t>(</m:t>
+                  </m:r>
+                  <m:r>
+                    <m:t>o</m:t>
+                  </m:r>
+                  <m:r>
+                    <m:rPr>
+                      <m:sty m:val="p"/>
+                    </m:rPr>
+                    <m:t>)</m:t>
+                  </m:r>
+                </m:e>
+                <m:lim>
+                  <m:r>
+                    <m:rPr>
+                      <m:sty m:val="p"/>
+                    </m:rPr>
+                    <m:t>⏟</m:t>
+                  </m:r>
+                </m:lim>
+              </m:limLow>
+            </m:e>
+            <m:lim>
+              <m:r>
+                <m:rPr>
+                  <m:nor/>
+                  <m:sty m:val="p"/>
+                </m:rPr>
+                <m:t>Log Evidence (Surprise)</m:t>
+              </m:r>
+            </m:lim>
+          </m:limLow>
+          <m:r>
+            <m:t> </m:t>
+          </m:r>
+          <m:r>
+            <m:rPr>
+              <m:sty m:val="p"/>
+            </m:rPr>
+            <m:t>≥</m:t>
+          </m:r>
+          <m:r>
+            <m:t> </m:t>
+          </m:r>
+          <m:r>
+            <m:rPr>
+              <m:sty m:val="p"/>
+            </m:rPr>
+            <m:t>−</m:t>
+          </m:r>
+          <m:r>
+            <m:rPr>
+              <m:sty m:val="p"/>
+            </m:rPr>
+            <m:t>ln</m:t>
+          </m:r>
+          <m:r>
+            <m:t>p</m:t>
+          </m:r>
+          <m:r>
+            <m:rPr>
+              <m:sty m:val="p"/>
+            </m:rPr>
+            <m:t>(</m:t>
+          </m:r>
+          <m:r>
+            <m:t>o</m:t>
+          </m:r>
+          <m:r>
+            <m:rPr>
+              <m:sty m:val="p"/>
+            </m:rPr>
+            <m:t>)</m:t>
+          </m:r>
+        </m:oMath>
+      </m:oMathPara>
+    </w:p>
+    <w:p>
+      <w:pPr>
+        <w:pStyle w:val="FirstParagraph"/>
+      </w:pPr>
+      <w:r>
+        <w:t xml:space="preserve">To minimize free energy, the organism operates across two complementary active loops:</w:t>
+      </w:r>
+      <w:r>
+        <w:t xml:space="preserve"> </w:t>
+      </w:r>
+      <w:r>
+        <w:t xml:space="preserve">1.</w:t>
+      </w:r>
+      <w:r>
+        <w:t xml:space="preserve"> </w:t>
+      </w:r>
+      <w:r>
+        <w:rPr>
+          <w:b/>
+          <w:bCs/>
+        </w:rPr>
+        <w:t xml:space="preserve">Perceptual Inference (Belief Updating):</w:t>
+      </w:r>
+      <w:r>
+        <w:t xml:space="preserve"> </w:t>
+      </w:r>
+      <w:r>
+        <w:t xml:space="preserve">The brain changes its internal beliefs (</w:t>
+      </w:r>
+      <m:oMath>
+        <m:r>
+          <m:t>q</m:t>
+        </m:r>
+        <m:r>
+          <m:rPr>
+            <m:sty m:val="p"/>
+          </m:rPr>
+          <m:t>(</m:t>
+        </m:r>
+        <m:r>
+          <m:t>s</m:t>
+        </m:r>
+        <m:r>
+          <m:rPr>
+            <m:sty m:val="p"/>
+          </m:rPr>
+          <m:t>)</m:t>
+        </m:r>
+      </m:oMath>
+      <w:r>
+        <w:t xml:space="preserve">) to match incoming sensory observations (</w:t>
+      </w:r>
+      <m:oMath>
+        <m:r>
+          <m:t>o</m:t>
+        </m:r>
+      </m:oMath>
+      <w:r>
+        <w:t xml:space="preserve">), minimizing prediction error.</w:t>
+      </w:r>
+      <w:r>
+        <w:t xml:space="preserve"> </w:t>
+      </w:r>
+      <w:r>
+        <w:t xml:space="preserve">2.</w:t>
+      </w:r>
+      <w:r>
+        <w:t xml:space="preserve"> </w:t>
+      </w:r>
+      <w:r>
+        <w:rPr>
+          <w:b/>
+          <w:bCs/>
+        </w:rPr>
+        <w:t xml:space="preserve">Active Inference (Action Selection):</w:t>
+      </w:r>
+      <w:r>
+        <w:t xml:space="preserve"> </w:t>
+      </w:r>
+      <w:r>
+        <w:t xml:space="preserve">The organism executes physical actions (</w:t>
+      </w:r>
+      <m:oMath>
+        <m:r>
+          <m:t>u</m:t>
+        </m:r>
+      </m:oMath>
+      <w:r>
+        <w:t xml:space="preserve">) upon the external environment to force incoming observations (</w:t>
+      </w:r>
+      <m:oMath>
+        <m:r>
+          <m:t>o</m:t>
+        </m:r>
+      </m:oMath>
+      <w:r>
+        <w:t xml:space="preserve">) to conform to its innate prior preferences (</w:t>
+      </w:r>
+      <m:oMath>
+        <m:r>
+          <m:t>C</m:t>
+        </m:r>
+      </m:oMath>
+      <w:r>
+        <w:t xml:space="preserve">).</w:t>
+      </w:r>
+    </w:p>
+    <w:p>
+      <w:r>
+        <w:pict>
+          <v:rect style="width:0;height:1.5pt" o:hralign="center" o:hrstd="t" o:hr="t"/>
+        </w:pict>
+      </w:r>
+    </w:p>
+    <w:bookmarkEnd w:id="59"/>
+    <w:bookmarkStart w:id="60" w:name="X62d9317d2acae030ef1de848d56ad4a3e396779"/>
+    <w:p>
+      <w:pPr>
+        <w:pStyle w:val="Heading3"/>
+      </w:pPr>
+      <w:r>
+        <w:t xml:space="preserve">2. The POMDP Generative Model Parameters &amp; The Soul’s Layers</w:t>
+      </w:r>
+    </w:p>
+    <w:p>
+      <w:pPr>
+        <w:pStyle w:val="FirstParagraph"/>
+      </w:pPr>
+      <w:r>
+        <w:t xml:space="preserve">In computational neuroscience, the internal predictive model of the organism is formalized as a discrete-time Partially Observable Markov Decision Process (POMDP). Each mathematical parameter corresponds directly to one of the soul’s architectural layers:</w:t>
+      </w:r>
+    </w:p>
+    <w:tbl>
+      <w:tblPr>
+        <w:tblStyle w:val="Table"/>
+        <w:tblW w:type="pct" w:w="5000"/>
+        <w:tblLayout w:type="fixed"/>
+        <w:tblLook w:firstRow="1" w:lastRow="0" w:firstColumn="0" w:lastColumn="0" w:noHBand="0" w:noVBand="0" w:val="0020"/>
+      </w:tblPr>
+      <w:tblGrid>
+        <w:gridCol w:w="1980"/>
+        <w:gridCol w:w="1980"/>
+        <w:gridCol w:w="1980"/>
+        <w:gridCol w:w="1980"/>
+      </w:tblGrid>
+      <w:tr>
+        <w:trPr>
+          <w:tblHeader w:val="on"/>
+        </w:trPr>
+        <w:tc>
+          <w:tcPr/>
+          <w:p>
+            <w:pPr>
+              <w:pStyle w:val="Compact"/>
+              <w:jc w:val="left"/>
+            </w:pPr>
+            <w:r>
+              <w:t xml:space="preserve">Parameter</w:t>
+            </w:r>
+          </w:p>
+        </w:tc>
+        <w:tc>
+          <w:tcPr/>
+          <w:p>
+            <w:pPr>
+              <w:pStyle w:val="Compact"/>
+              <w:jc w:val="left"/>
+            </w:pPr>
+            <w:r>
+              <w:t xml:space="preserve">Mathematical Object</w:t>
+            </w:r>
+          </w:p>
+        </w:tc>
+        <w:tc>
+          <w:tcPr/>
+          <w:p>
+            <w:pPr>
+              <w:pStyle w:val="Compact"/>
+              <w:jc w:val="left"/>
+            </w:pPr>
+            <w:r>
+              <w:t xml:space="preserve">Active Inference Role</w:t>
+            </w:r>
+          </w:p>
+        </w:tc>
+        <w:tc>
+          <w:tcPr/>
+          <w:p>
+            <w:pPr>
+              <w:pStyle w:val="Compact"/>
+              <w:jc w:val="left"/>
+            </w:pPr>
+            <w:r>
+              <w:t xml:space="preserve">Soul Architecture Mapping</w:t>
+            </w:r>
+          </w:p>
+        </w:tc>
+      </w:tr>
+      <w:tr>
+        <w:tc>
+          <w:tcPr/>
+          <w:p>
+            <w:pPr>
+              <w:pStyle w:val="Compact"/>
+              <w:jc w:val="left"/>
+            </w:pPr>
+            <m:oMath>
+              <m:sSub>
+                <m:e>
+                  <m:r>
+                    <m:t>D</m:t>
+                  </m:r>
+                </m:e>
+                <m:sub>
+                  <m:r>
+                    <m:t>0</m:t>
+                  </m:r>
+                </m:sub>
+              </m:sSub>
+            </m:oMath>
+          </w:p>
+        </w:tc>
+        <w:tc>
+          <w:tcPr/>
+          <w:p>
+            <w:pPr>
+              <w:pStyle w:val="Compact"/>
+              <w:jc w:val="left"/>
+            </w:pPr>
+            <w:r>
+              <w:t xml:space="preserve">Initial State Distribution</w:t>
+            </w:r>
+            <w:r>
+              <w:t xml:space="preserve"> </w:t>
+            </w:r>
+            <m:oMath>
+              <m:r>
+                <m:t>P</m:t>
+              </m:r>
+              <m:r>
+                <m:rPr>
+                  <m:sty m:val="p"/>
+                </m:rPr>
+                <m:t>(</m:t>
+              </m:r>
+              <m:sSub>
+                <m:e>
+                  <m:r>
+                    <m:t>s</m:t>
+                  </m:r>
+                </m:e>
+                <m:sub>
+                  <m:r>
+                    <m:t>0</m:t>
+                  </m:r>
+                </m:sub>
+              </m:sSub>
+              <m:r>
+                <m:rPr>
+                  <m:sty m:val="p"/>
+                </m:rPr>
+                <m:t>)</m:t>
+              </m:r>
+            </m:oMath>
+          </w:p>
+        </w:tc>
+        <w:tc>
+          <w:tcPr/>
+          <w:p>
+            <w:pPr>
+              <w:pStyle w:val="Compact"/>
+              <w:jc w:val="left"/>
+            </w:pPr>
+            <w:r>
+              <w:t xml:space="preserve">Innate phylogenetic priors; hardwired homeostatic setpoints</w:t>
+            </w:r>
+          </w:p>
+        </w:tc>
+        <w:tc>
+          <w:tcPr/>
+          <w:p>
+            <w:pPr>
+              <w:pStyle w:val="Compact"/>
+              <w:jc w:val="left"/>
+            </w:pPr>
+            <w:r>
+              <w:rPr>
+                <w:b/>
+                <w:bCs/>
+              </w:rPr>
+              <w:t xml:space="preserve">Layer 2: Genetics (</w:t>
+            </w:r>
+            <m:oMath>
+              <m:r>
+                <m:t>15</m:t>
+              </m:r>
+              <m:r>
+                <m:t> </m:t>
+              </m:r>
+              <m:r>
+                <m:rPr>
+                  <m:sty m:val="p"/>
+                </m:rPr>
+                <m:t>%</m:t>
+              </m:r>
+            </m:oMath>
+            <w:r>
+              <w:rPr>
+                <w:b/>
+                <w:bCs/>
+              </w:rPr>
+              <w:t xml:space="preserve">)</w:t>
+            </w:r>
+            <w:r>
+              <w:t xml:space="preserve">Brainstem &amp; limbic baseline (</w:t>
+            </w:r>
+            <w:r>
+              <w:rPr>
+                <w:i/>
+                <w:iCs/>
+              </w:rPr>
+              <w:t xml:space="preserve">Conatus</w:t>
+            </w:r>
+            <w:r>
+              <w:t xml:space="preserve">)</w:t>
+            </w:r>
+          </w:p>
+        </w:tc>
+      </w:tr>
+      <w:tr>
+        <w:tc>
+          <w:tcPr/>
+          <w:p>
+            <w:pPr>
+              <w:pStyle w:val="Compact"/>
+              <w:jc w:val="left"/>
+            </w:pPr>
+            <m:oMath>
+              <m:r>
+                <m:t>A</m:t>
+              </m:r>
+            </m:oMath>
+          </w:p>
+        </w:tc>
+        <w:tc>
+          <w:tcPr/>
+          <w:p>
+            <w:pPr>
+              <w:pStyle w:val="Compact"/>
+              <w:jc w:val="left"/>
+            </w:pPr>
+            <w:r>
+              <w:t xml:space="preserve">Likelihood Matrix</w:t>
+            </w:r>
+            <w:r>
+              <w:t xml:space="preserve"> </w:t>
+            </w:r>
+            <m:oMath>
+              <m:r>
+                <m:t>P</m:t>
+              </m:r>
+              <m:r>
+                <m:rPr>
+                  <m:sty m:val="p"/>
+                </m:rPr>
+                <m:t>(</m:t>
+              </m:r>
+              <m:sSub>
+                <m:e>
+                  <m:r>
+                    <m:t>o</m:t>
+                  </m:r>
+                </m:e>
+                <m:sub>
+                  <m:r>
+                    <m:t>t</m:t>
+                  </m:r>
+                </m:sub>
+              </m:sSub>
+              <m:r>
+                <m:rPr>
+                  <m:sty m:val="p"/>
+                </m:rPr>
+                <m:t>∣</m:t>
+              </m:r>
+              <m:sSub>
+                <m:e>
+                  <m:r>
+                    <m:t>s</m:t>
+                  </m:r>
+                </m:e>
+                <m:sub>
+                  <m:r>
+                    <m:t>t</m:t>
+                  </m:r>
+                </m:sub>
+              </m:sSub>
+              <m:r>
+                <m:rPr>
+                  <m:sty m:val="p"/>
+                </m:rPr>
+                <m:t>)</m:t>
+              </m:r>
+            </m:oMath>
+          </w:p>
+        </w:tc>
+        <w:tc>
+          <w:tcPr/>
+          <w:p>
+            <w:pPr>
+              <w:pStyle w:val="Compact"/>
+              <w:jc w:val="left"/>
+            </w:pPr>
+            <w:r>
+              <w:t xml:space="preserve">Mapping between hidden causes (</w:t>
+            </w:r>
+            <m:oMath>
+              <m:r>
+                <m:t>s</m:t>
+              </m:r>
+            </m:oMath>
+            <w:r>
+              <w:t xml:space="preserve">) and sensory inputs (</w:t>
+            </w:r>
+            <m:oMath>
+              <m:r>
+                <m:t>o</m:t>
+              </m:r>
+            </m:oMath>
+            <w:r>
+              <w:t xml:space="preserve">)</w:t>
+            </w:r>
+          </w:p>
+        </w:tc>
+        <w:tc>
+          <w:tcPr/>
+          <w:p>
+            <w:pPr>
+              <w:pStyle w:val="Compact"/>
+              <w:jc w:val="left"/>
+            </w:pPr>
+            <w:r>
+              <w:rPr>
+                <w:b/>
+                <w:bCs/>
+              </w:rPr>
+              <w:t xml:space="preserve">Layer 5: Lifelong Learning (</w:t>
+            </w:r>
+            <m:oMath>
+              <m:r>
+                <m:t>25</m:t>
+              </m:r>
+              <m:r>
+                <m:t> </m:t>
+              </m:r>
+              <m:r>
+                <m:rPr>
+                  <m:sty m:val="p"/>
+                </m:rPr>
+                <m:t>%</m:t>
+              </m:r>
+            </m:oMath>
+            <w:r>
+              <w:rPr>
+                <w:b/>
+                <w:bCs/>
+              </w:rPr>
+              <w:t xml:space="preserve">)</w:t>
+            </w:r>
+            <w:r>
+              <w:t xml:space="preserve">Cortical-hippocampal memory engrams</w:t>
+            </w:r>
+          </w:p>
+        </w:tc>
+      </w:tr>
+      <w:tr>
+        <w:tc>
+          <w:tcPr/>
+          <w:p>
+            <w:pPr>
+              <w:pStyle w:val="Compact"/>
+              <w:jc w:val="left"/>
+            </w:pPr>
+            <m:oMath>
+              <m:r>
+                <m:t>B</m:t>
+              </m:r>
+            </m:oMath>
+          </w:p>
+        </w:tc>
+        <w:tc>
+          <w:tcPr/>
+          <w:p>
+            <w:pPr>
+              <w:pStyle w:val="Compact"/>
+              <w:jc w:val="left"/>
+            </w:pPr>
+            <w:r>
+              <w:t xml:space="preserve">Transition Tensor</w:t>
+            </w:r>
+            <w:r>
+              <w:t xml:space="preserve"> </w:t>
+            </w:r>
+            <m:oMath>
+              <m:r>
+                <m:t>P</m:t>
+              </m:r>
+              <m:r>
+                <m:rPr>
+                  <m:sty m:val="p"/>
+                </m:rPr>
+                <m:t>(</m:t>
+              </m:r>
+              <m:sSub>
+                <m:e>
+                  <m:r>
+                    <m:t>s</m:t>
+                  </m:r>
+                </m:e>
+                <m:sub>
+                  <m:r>
+                    <m:t>t</m:t>
+                  </m:r>
+                  <m:r>
+                    <m:rPr>
+                      <m:sty m:val="p"/>
+                    </m:rPr>
+                    <m:t>+</m:t>
+                  </m:r>
+                  <m:r>
+                    <m:t>1</m:t>
+                  </m:r>
+                </m:sub>
+              </m:sSub>
+              <m:r>
+                <m:rPr>
+                  <m:sty m:val="p"/>
+                </m:rPr>
+                <m:t>∣</m:t>
+              </m:r>
+              <m:sSub>
+                <m:e>
+                  <m:r>
+                    <m:t>s</m:t>
+                  </m:r>
+                </m:e>
+                <m:sub>
+                  <m:r>
+                    <m:t>t</m:t>
+                  </m:r>
+                </m:sub>
+              </m:sSub>
+              <m:r>
+                <m:rPr>
+                  <m:sty m:val="p"/>
+                </m:rPr>
+                <m:t>,</m:t>
+              </m:r>
+              <m:sSub>
+                <m:e>
+                  <m:r>
+                    <m:t>u</m:t>
+                  </m:r>
+                </m:e>
+                <m:sub>
+                  <m:r>
+                    <m:t>t</m:t>
+                  </m:r>
+                </m:sub>
+              </m:sSub>
+              <m:r>
+                <m:rPr>
+                  <m:sty m:val="p"/>
+                </m:rPr>
+                <m:t>)</m:t>
+              </m:r>
+            </m:oMath>
+          </w:p>
+        </w:tc>
+        <w:tc>
+          <w:tcPr/>
+          <w:p>
+            <w:pPr>
+              <w:pStyle w:val="Compact"/>
+              <w:jc w:val="left"/>
+            </w:pPr>
+            <w:r>
+              <w:t xml:space="preserve">Action-dependent causal dynamics; internal simulator of the world</w:t>
+            </w:r>
+          </w:p>
+        </w:tc>
+        <w:tc>
+          <w:tcPr/>
+          <w:p>
+            <w:pPr>
+              <w:pStyle w:val="Compact"/>
+              <w:jc w:val="left"/>
+            </w:pPr>
+            <w:r>
+              <w:rPr>
+                <w:b/>
+                <w:bCs/>
+              </w:rPr>
+              <w:t xml:space="preserve">Layer 5: Biographical Experience (</w:t>
+            </w:r>
+            <m:oMath>
+              <m:r>
+                <m:t>25</m:t>
+              </m:r>
+              <m:r>
+                <m:t> </m:t>
+              </m:r>
+              <m:r>
+                <m:rPr>
+                  <m:sty m:val="p"/>
+                </m:rPr>
+                <m:t>%</m:t>
+              </m:r>
+            </m:oMath>
+            <w:r>
+              <w:rPr>
+                <w:b/>
+                <w:bCs/>
+              </w:rPr>
+              <w:t xml:space="preserve">)</w:t>
+            </w:r>
+            <w:r>
+              <w:t xml:space="preserve">World-model &amp; narrative self</w:t>
+            </w:r>
+          </w:p>
+        </w:tc>
+      </w:tr>
+      <w:tr>
+        <w:tc>
+          <w:tcPr/>
+          <w:p>
+            <w:pPr>
+              <w:pStyle w:val="Compact"/>
+              <w:jc w:val="left"/>
+            </w:pPr>
+            <m:oMath>
+              <m:r>
+                <m:t>C</m:t>
+              </m:r>
+            </m:oMath>
+          </w:p>
+        </w:tc>
+        <w:tc>
+          <w:tcPr/>
+          <w:p>
+            <w:pPr>
+              <w:pStyle w:val="Compact"/>
+              <w:jc w:val="left"/>
+            </w:pPr>
+            <w:r>
+              <w:t xml:space="preserve">Preference Vector</w:t>
+            </w:r>
+            <w:r>
+              <w:t xml:space="preserve"> </w:t>
+            </w:r>
+            <m:oMath>
+              <m:r>
+                <m:rPr>
+                  <m:sty m:val="p"/>
+                </m:rPr>
+                <m:t>ln</m:t>
+              </m:r>
+              <m:r>
+                <m:t>P</m:t>
+              </m:r>
+              <m:r>
+                <m:rPr>
+                  <m:sty m:val="p"/>
+                </m:rPr>
+                <m:t>(</m:t>
+              </m:r>
+              <m:r>
+                <m:t>o</m:t>
+              </m:r>
+              <m:r>
+                <m:rPr>
+                  <m:sty m:val="p"/>
+                </m:rPr>
+                <m:t>)</m:t>
+              </m:r>
+            </m:oMath>
+          </w:p>
+        </w:tc>
+        <w:tc>
+          <w:tcPr/>
+          <w:p>
+            <w:pPr>
+              <w:pStyle w:val="Compact"/>
+              <w:jc w:val="left"/>
+            </w:pPr>
+            <w:r>
+              <w:t xml:space="preserve">Desired homeostatic distributions (goals, safety, survival values)</w:t>
+            </w:r>
+          </w:p>
+        </w:tc>
+        <w:tc>
+          <w:tcPr/>
+          <w:p>
+            <w:pPr>
+              <w:pStyle w:val="Compact"/>
+              <w:jc w:val="left"/>
+            </w:pPr>
+            <w:r>
+              <w:rPr>
+                <w:b/>
+                <w:bCs/>
+              </w:rPr>
+              <w:t xml:space="preserve">6th Axiom: The Will to Exist</w:t>
+            </w:r>
+            <w:r>
+              <w:t xml:space="preserve">Conative goal state (</w:t>
+            </w:r>
+            <m:oMath>
+              <m:r>
+                <m:rPr>
+                  <m:sty m:val="p"/>
+                </m:rPr>
+                <m:t>Φ</m:t>
+              </m:r>
+              <m:r>
+                <m:rPr>
+                  <m:sty m:val="p"/>
+                </m:rPr>
+                <m:t>&gt;</m:t>
+              </m:r>
+              <m:r>
+                <m:t>0</m:t>
+              </m:r>
+            </m:oMath>
+            <w:r>
+              <w:t xml:space="preserve">)</w:t>
+            </w:r>
+          </w:p>
+        </w:tc>
+      </w:tr>
+      <w:tr>
+        <w:tc>
+          <w:tcPr/>
+          <w:p>
+            <w:pPr>
+              <w:pStyle w:val="Compact"/>
+              <w:jc w:val="left"/>
+            </w:pPr>
+            <m:oMath>
+              <m:r>
+                <m:t>γ</m:t>
+              </m:r>
+            </m:oMath>
+          </w:p>
+        </w:tc>
+        <w:tc>
+          <w:tcPr/>
+          <w:p>
+            <w:pPr>
+              <w:pStyle w:val="Compact"/>
+              <w:jc w:val="left"/>
+            </w:pPr>
+            <w:r>
+              <w:t xml:space="preserve">Precision Parameter</w:t>
+            </w:r>
+            <w:r>
+              <w:t xml:space="preserve"> </w:t>
+            </w:r>
+            <m:oMath>
+              <m:r>
+                <m:rPr>
+                  <m:sty m:val="p"/>
+                </m:rPr>
+                <m:t>(</m:t>
+              </m:r>
+              <m:sSup>
+                <m:e>
+                  <m:r>
+                    <m:t>σ</m:t>
+                  </m:r>
+                </m:e>
+                <m:sup>
+                  <m:r>
+                    <m:t>2</m:t>
+                  </m:r>
+                </m:sup>
+              </m:sSup>
+              <m:sSup>
+                <m:e>
+                  <m:r>
+                    <m:rPr>
+                      <m:sty m:val="p"/>
+                    </m:rPr>
+                    <m:t>)</m:t>
+                  </m:r>
+                </m:e>
+                <m:sup>
+                  <m:r>
+                    <m:rPr>
+                      <m:sty m:val="p"/>
+                    </m:rPr>
+                    <m:t>−</m:t>
+                  </m:r>
+                  <m:r>
+                    <m:t>1</m:t>
+                  </m:r>
+                </m:sup>
+              </m:sSup>
+            </m:oMath>
+          </w:p>
+        </w:tc>
+        <w:tc>
+          <w:tcPr/>
+          <w:p>
+            <w:pPr>
+              <w:pStyle w:val="Compact"/>
+              <w:jc w:val="left"/>
+            </w:pPr>
+            <w:r>
+              <w:t xml:space="preserve">Confidence weighting placed on sensory prediction errors</w:t>
+            </w:r>
+          </w:p>
+        </w:tc>
+        <w:tc>
+          <w:tcPr/>
+          <w:p>
+            <w:pPr>
+              <w:pStyle w:val="Compact"/>
+              <w:jc w:val="left"/>
+            </w:pPr>
+            <w:r>
+              <w:rPr>
+                <w:b/>
+                <w:bCs/>
+              </w:rPr>
+              <w:t xml:space="preserve">Layer 4: Epigenetics (</w:t>
+            </w:r>
+            <m:oMath>
+              <m:r>
+                <m:t>10</m:t>
+              </m:r>
+              <m:r>
+                <m:t> </m:t>
+              </m:r>
+              <m:r>
+                <m:rPr>
+                  <m:sty m:val="p"/>
+                </m:rPr>
+                <m:t>%</m:t>
+              </m:r>
+            </m:oMath>
+            <w:r>
+              <w:rPr>
+                <w:b/>
+                <w:bCs/>
+              </w:rPr>
+              <w:t xml:space="preserve">)</w:t>
+            </w:r>
+            <w:r>
+              <w:t xml:space="preserve">Transgenerational stress sensitivity</w:t>
+            </w:r>
+          </w:p>
+        </w:tc>
+      </w:tr>
+      <w:tr>
+        <w:tc>
+          <w:tcPr/>
+          <w:p>
+            <w:pPr>
+              <w:pStyle w:val="Compact"/>
+              <w:jc w:val="left"/>
+            </w:pPr>
+            <w:r>
+              <w:rPr>
+                <w:b/>
+                <w:bCs/>
+              </w:rPr>
+              <w:t xml:space="preserve">Blanket</w:t>
+            </w:r>
+          </w:p>
+        </w:tc>
+        <w:tc>
+          <w:tcPr/>
+          <w:p>
+            <w:pPr>
+              <w:pStyle w:val="Compact"/>
+              <w:jc w:val="left"/>
+            </w:pPr>
+            <w:r>
+              <w:t xml:space="preserve">Markov Partition</w:t>
+            </w:r>
+            <w:r>
+              <w:t xml:space="preserve"> </w:t>
+            </w:r>
+            <m:oMath>
+              <m:r>
+                <m:rPr>
+                  <m:sty m:val="p"/>
+                </m:rPr>
+                <m:t>(</m:t>
+              </m:r>
+              <m:r>
+                <m:t>η</m:t>
+              </m:r>
+              <m:r>
+                <m:rPr>
+                  <m:sty m:val="p"/>
+                </m:rPr>
+                <m:t>,</m:t>
+              </m:r>
+              <m:r>
+                <m:t>s</m:t>
+              </m:r>
+              <m:r>
+                <m:rPr>
+                  <m:sty m:val="p"/>
+                </m:rPr>
+                <m:t>,</m:t>
+              </m:r>
+              <m:r>
+                <m:t>a</m:t>
+              </m:r>
+              <m:r>
+                <m:rPr>
+                  <m:sty m:val="p"/>
+                </m:rPr>
+                <m:t>,</m:t>
+              </m:r>
+              <m:r>
+                <m:t>μ</m:t>
+              </m:r>
+              <m:r>
+                <m:rPr>
+                  <m:sty m:val="p"/>
+                </m:rPr>
+                <m:t>)</m:t>
+              </m:r>
+            </m:oMath>
+          </w:p>
+        </w:tc>
+        <w:tc>
+          <w:tcPr/>
+          <w:p>
+            <w:pPr>
+              <w:pStyle w:val="Compact"/>
+              <w:jc w:val="left"/>
+            </w:pPr>
+            <w:r>
+              <w:t xml:space="preserve">Statistical phase-space separation between Self and World</w:t>
+            </w:r>
+          </w:p>
+        </w:tc>
+        <w:tc>
+          <w:tcPr/>
+          <w:p>
+            <w:pPr>
+              <w:pStyle w:val="Compact"/>
+              <w:jc w:val="left"/>
+            </w:pPr>
+            <w:r>
+              <w:rPr>
+                <w:b/>
+                <w:bCs/>
+              </w:rPr>
+              <w:t xml:space="preserve">Layer 6: Ego Tunnel / PSM (</w:t>
+            </w:r>
+            <m:oMath>
+              <m:r>
+                <m:t>10</m:t>
+              </m:r>
+              <m:r>
+                <m:t> </m:t>
+              </m:r>
+              <m:r>
+                <m:rPr>
+                  <m:sty m:val="p"/>
+                </m:rPr>
+                <m:t>%</m:t>
+              </m:r>
+            </m:oMath>
+            <w:r>
+              <w:rPr>
+                <w:b/>
+                <w:bCs/>
+              </w:rPr>
+              <w:t xml:space="preserve">)</w:t>
+            </w:r>
+            <w:r>
+              <w:t xml:space="preserve">The Dissociated Boundary (</w:t>
+            </w:r>
+            <w:r>
+              <w:rPr>
+                <w:i/>
+                <w:iCs/>
+              </w:rPr>
+              <w:t xml:space="preserve">Alter</w:t>
+            </w:r>
+            <w:r>
+              <w:t xml:space="preserve">)</w:t>
+            </w:r>
+          </w:p>
+        </w:tc>
+      </w:tr>
+    </w:tbl>
+    <w:p>
+      <w:r>
+        <w:pict>
+          <v:rect style="width:0;height:1.5pt" o:hralign="center" o:hrstd="t" o:hr="t"/>
+        </w:pict>
+      </w:r>
+    </w:p>
+    <w:bookmarkEnd w:id="60"/>
+    <w:bookmarkStart w:id="61" w:name="X12eb69c506fb31f26df3e83d7677e37be9372cd"/>
+    <w:p>
+      <w:pPr>
+        <w:pStyle w:val="Heading3"/>
+      </w:pPr>
+      <w:r>
+        <w:t xml:space="preserve">3. Precision Weighting (</w:t>
+      </w:r>
+      <m:oMath>
+        <m:r>
+          <m:t>γ</m:t>
+        </m:r>
+      </m:oMath>
+      <w:r>
+        <w:t xml:space="preserve">) and Transgenerational Epigenetics</w:t>
+      </w:r>
+    </w:p>
+    <w:p>
+      <w:pPr>
+        <w:pStyle w:val="FirstParagraph"/>
+      </w:pPr>
+      <w:r>
+        <w:t xml:space="preserve">Prediction errors are not treated equally. The brain scales each error by a</w:t>
+      </w:r>
+      <w:r>
+        <w:t xml:space="preserve"> </w:t>
+      </w:r>
+      <w:r>
+        <w:rPr>
+          <w:b/>
+          <w:bCs/>
+        </w:rPr>
+        <w:t xml:space="preserve">Precision Weight (</w:t>
+      </w:r>
+      <m:oMath>
+        <m:r>
+          <m:t>γ</m:t>
+        </m:r>
+      </m:oMath>
+      <w:r>
+        <w:rPr>
+          <w:b/>
+          <w:bCs/>
+        </w:rPr>
+        <w:t xml:space="preserve">)</w:t>
+      </w:r>
+      <w:r>
+        <w:t xml:space="preserve">:</w:t>
+      </w:r>
+    </w:p>
+    <w:p>
+      <w:pPr>
+        <w:pStyle w:val="BodyText"/>
+      </w:pPr>
+      <m:oMathPara>
+        <m:oMathParaPr>
+          <m:jc m:val="center"/>
+        </m:oMathParaPr>
+        <m:oMath>
+          <m:r>
+            <m:rPr>
+              <m:nor/>
+              <m:sty m:val="p"/>
+            </m:rPr>
+            <m:t>Effective Update</m:t>
+          </m:r>
+          <m:r>
+            <m:rPr>
+              <m:sty m:val="p"/>
+            </m:rPr>
+            <m:t>=</m:t>
+          </m:r>
+          <m:r>
+            <m:t>γ</m:t>
+          </m:r>
+          <m:r>
+            <m:rPr>
+              <m:sty m:val="p"/>
+            </m:rPr>
+            <m:t>⋅</m:t>
+          </m:r>
+          <m:d>
+            <m:dPr>
+              <m:begChr m:val="("/>
+              <m:sepChr m:val=""/>
+              <m:endChr m:val=")"/>
+              <m:grow/>
+            </m:dPr>
+            <m:e>
+              <m:sSub>
+                <m:e>
+                  <m:r>
+                    <m:t>o</m:t>
+                  </m:r>
+                </m:e>
+                <m:sub>
+                  <m:r>
+                    <m:t>t</m:t>
+                  </m:r>
+                </m:sub>
+              </m:sSub>
+              <m:r>
+                <m:rPr>
+                  <m:sty m:val="p"/>
+                </m:rPr>
+                <m:t>−</m:t>
+              </m:r>
+              <m:r>
+                <m:t>g</m:t>
+              </m:r>
+              <m:r>
+                <m:rPr>
+                  <m:sty m:val="p"/>
+                </m:rPr>
+                <m:t>(</m:t>
+              </m:r>
+              <m:sSub>
+                <m:e>
+                  <m:r>
+                    <m:t>s</m:t>
+                  </m:r>
+                </m:e>
+                <m:sub>
+                  <m:r>
+                    <m:t>t</m:t>
+                  </m:r>
+                </m:sub>
+              </m:sSub>
+              <m:r>
+                <m:rPr>
+                  <m:sty m:val="p"/>
+                </m:rPr>
+                <m:t>)</m:t>
+              </m:r>
+            </m:e>
+          </m:d>
+        </m:oMath>
+      </m:oMathPara>
+    </w:p>
+    <w:p>
+      <w:pPr>
+        <w:pStyle w:val="FirstParagraph"/>
+      </w:pPr>
+      <w:r>
+        <w:t xml:space="preserve">*</w:t>
+      </w:r>
+      <w:r>
+        <w:t xml:space="preserve"> </w:t>
+      </w:r>
+      <w:r>
+        <w:rPr>
+          <w:b/>
+          <w:bCs/>
+        </w:rPr>
+        <w:t xml:space="preserve">High Precision (</w:t>
+      </w:r>
+      <m:oMath>
+        <m:r>
+          <m:t>γ</m:t>
+        </m:r>
+        <m:r>
+          <m:rPr>
+            <m:sty m:val="p"/>
+          </m:rPr>
+          <m:t>↑</m:t>
+        </m:r>
+      </m:oMath>
+      <w:r>
+        <w:rPr>
+          <w:b/>
+          <w:bCs/>
+        </w:rPr>
+        <w:t xml:space="preserve">):</w:t>
+      </w:r>
+      <w:r>
+        <w:t xml:space="preserve"> </w:t>
+      </w:r>
+      <w:r>
+        <w:t xml:space="preserve">The sensory channel is deemed highly reliable; prediction errors force immediate, profound revisions of internal beliefs.</w:t>
+      </w:r>
+      <w:r>
+        <w:t xml:space="preserve"> </w:t>
+      </w:r>
+      <w:r>
+        <w:t xml:space="preserve">*</w:t>
+      </w:r>
+      <w:r>
+        <w:t xml:space="preserve"> </w:t>
+      </w:r>
+      <w:r>
+        <w:rPr>
+          <w:b/>
+          <w:bCs/>
+        </w:rPr>
+        <w:t xml:space="preserve">Low Precision (</w:t>
+      </w:r>
+      <m:oMath>
+        <m:r>
+          <m:t>γ</m:t>
+        </m:r>
+        <m:r>
+          <m:rPr>
+            <m:sty m:val="p"/>
+          </m:rPr>
+          <m:t>↓</m:t>
+        </m:r>
+      </m:oMath>
+      <w:r>
+        <w:rPr>
+          <w:b/>
+          <w:bCs/>
+        </w:rPr>
+        <w:t xml:space="preserve">):</w:t>
+      </w:r>
+      <w:r>
+        <w:t xml:space="preserve"> </w:t>
+      </w:r>
+      <w:r>
+        <w:t xml:space="preserve">The sensory channel is treated as noisy; the organism ignores the input and relies dogmatically on its top-down priors.</w:t>
+      </w:r>
+    </w:p>
+    <w:p>
+      <w:pPr>
+        <w:pStyle w:val="BodyText"/>
+      </w:pPr>
+      <w:r>
+        <w:rPr>
+          <w:b/>
+          <w:bCs/>
+        </w:rPr>
+        <w:t xml:space="preserve">The Epigenetic Connection:</w:t>
+      </w:r>
+      <w:r>
+        <w:t xml:space="preserve"> </w:t>
+      </w:r>
+      <w:r>
+        <w:t xml:space="preserve">While neurotransmitters (dopamine, acetylcholine, norepinephrine) modulate precision in real-time,</w:t>
+      </w:r>
+      <w:r>
+        <w:t xml:space="preserve"> </w:t>
+      </w:r>
+      <w:r>
+        <w:rPr>
+          <w:b/>
+          <w:bCs/>
+        </w:rPr>
+        <w:t xml:space="preserve">epigenetic histone acetylation and DNA methylation set the baseline tonic precision</w:t>
+      </w:r>
+      <w:r>
+        <w:t xml:space="preserve"> </w:t>
+      </w:r>
+      <w:r>
+        <w:t xml:space="preserve">across generations. An individual inheriting epigenetic marks of famine or trauma has hyper-sensitized precision weights on threat-detection circuits, experiencing ancestral vigilance before any personal life experience has occurred.</w:t>
+      </w:r>
+    </w:p>
+    <w:p>
+      <w:r>
+        <w:pict>
+          <v:rect style="width:0;height:1.5pt" o:hralign="center" o:hrstd="t" o:hr="t"/>
+        </w:pict>
+      </w:r>
+    </w:p>
+    <w:bookmarkEnd w:id="61"/>
+    <w:bookmarkStart w:id="62" w:name="Xc5c876f3feb8754d3e348f1b57107a6cabd197d"/>
+    <w:p>
+      <w:pPr>
+        <w:pStyle w:val="Heading3"/>
+      </w:pPr>
+      <w:r>
+        <w:t xml:space="preserve">4. The Markov Blanket: The Topological Boundary of Dissociation</w:t>
+      </w:r>
+    </w:p>
+    <w:p>
+      <w:pPr>
+        <w:pStyle w:val="FirstParagraph"/>
+      </w:pPr>
+      <w:r>
+        <w:t xml:space="preserve">In Friston’s formulation, a system exists as an individual entity if and only if its states can be partitioned into:</w:t>
+      </w:r>
+      <w:r>
+        <w:t xml:space="preserve"> </w:t>
+      </w:r>
+      <w:r>
+        <w:t xml:space="preserve">*</w:t>
+      </w:r>
+      <w:r>
+        <w:t xml:space="preserve"> </w:t>
+      </w:r>
+      <w:r>
+        <w:rPr>
+          <w:b/>
+          <w:bCs/>
+        </w:rPr>
+        <w:t xml:space="preserve">Internal States (</w:t>
+      </w:r>
+      <m:oMath>
+        <m:r>
+          <m:t>μ</m:t>
+        </m:r>
+      </m:oMath>
+      <w:r>
+        <w:rPr>
+          <w:b/>
+          <w:bCs/>
+        </w:rPr>
+        <w:t xml:space="preserve">):</w:t>
+      </w:r>
+      <w:r>
+        <w:t xml:space="preserve"> </w:t>
+      </w:r>
+      <w:r>
+        <w:t xml:space="preserve">The neural firing, organ dynamics, and cognitive processes of the organism.</w:t>
+      </w:r>
+      <w:r>
+        <w:t xml:space="preserve"> </w:t>
+      </w:r>
+      <w:r>
+        <w:t xml:space="preserve">*</w:t>
+      </w:r>
+      <w:r>
+        <w:t xml:space="preserve"> </w:t>
+      </w:r>
+      <w:r>
+        <w:rPr>
+          <w:b/>
+          <w:bCs/>
+        </w:rPr>
+        <w:t xml:space="preserve">External States (</w:t>
+      </w:r>
+      <m:oMath>
+        <m:r>
+          <m:t>η</m:t>
+        </m:r>
+      </m:oMath>
+      <w:r>
+        <w:rPr>
+          <w:b/>
+          <w:bCs/>
+        </w:rPr>
+        <w:t xml:space="preserve">):</w:t>
+      </w:r>
+      <w:r>
+        <w:t xml:space="preserve"> </w:t>
+      </w:r>
+      <w:r>
+        <w:t xml:space="preserve">Mind-at-Large and environmental processes outside the organism.</w:t>
+      </w:r>
+      <w:r>
+        <w:t xml:space="preserve"> </w:t>
+      </w:r>
+      <w:r>
+        <w:t xml:space="preserve">*</w:t>
+      </w:r>
+      <w:r>
+        <w:t xml:space="preserve"> </w:t>
+      </w:r>
+      <w:r>
+        <w:rPr>
+          <w:b/>
+          <w:bCs/>
+        </w:rPr>
+        <w:t xml:space="preserve">Blanket States:</w:t>
+      </w:r>
+      <w:r>
+        <w:t xml:space="preserve"> </w:t>
+      </w:r>
+      <w:r>
+        <w:t xml:space="preserve">Composed of</w:t>
+      </w:r>
+      <w:r>
+        <w:t xml:space="preserve"> </w:t>
+      </w:r>
+      <w:r>
+        <w:rPr>
+          <w:b/>
+          <w:bCs/>
+        </w:rPr>
+        <w:t xml:space="preserve">Sensory States (</w:t>
+      </w:r>
+      <m:oMath>
+        <m:r>
+          <m:t>s</m:t>
+        </m:r>
+      </m:oMath>
+      <w:r>
+        <w:rPr>
+          <w:b/>
+          <w:bCs/>
+        </w:rPr>
+        <w:t xml:space="preserve">)</w:t>
+      </w:r>
+      <w:r>
+        <w:t xml:space="preserve"> </w:t>
+      </w:r>
+      <w:r>
+        <w:t xml:space="preserve">(influenced by external states, affecting internal states) and</w:t>
+      </w:r>
+      <w:r>
+        <w:t xml:space="preserve"> </w:t>
+      </w:r>
+      <w:r>
+        <w:rPr>
+          <w:b/>
+          <w:bCs/>
+        </w:rPr>
+        <w:t xml:space="preserve">Active States (</w:t>
+      </w:r>
+      <m:oMath>
+        <m:r>
+          <m:t>a</m:t>
+        </m:r>
+      </m:oMath>
+      <w:r>
+        <w:rPr>
+          <w:b/>
+          <w:bCs/>
+        </w:rPr>
+        <w:t xml:space="preserve">)</w:t>
+      </w:r>
+      <w:r>
+        <w:t xml:space="preserve"> </w:t>
+      </w:r>
+      <w:r>
+        <w:t xml:space="preserve">(influenced by internal states, affecting external states).</w:t>
+      </w:r>
+    </w:p>
+    <w:p>
+      <w:pPr>
+        <w:pStyle w:val="BodyText"/>
+      </w:pPr>
+      <w:r>
+        <w:t xml:space="preserve">The Markov Blanket is the</w:t>
+      </w:r>
+      <w:r>
+        <w:t xml:space="preserve"> </w:t>
+      </w:r>
+      <w:r>
+        <w:rPr>
+          <w:b/>
+          <w:bCs/>
+        </w:rPr>
+        <w:t xml:space="preserve">statistical membrane of the Dissociated Alter</w:t>
+      </w:r>
+      <w:r>
+        <w:t xml:space="preserve">. It ensures conditional independence: the interior can only know the exterior through the sensory veil of the blanket. When this blanket is endowed with a</w:t>
+      </w:r>
+      <w:r>
+        <w:t xml:space="preserve"> </w:t>
+      </w:r>
+      <w:r>
+        <w:rPr>
+          <w:b/>
+          <w:bCs/>
+        </w:rPr>
+        <w:t xml:space="preserve">transparent Phenomenal Self-Model (PSM)</w:t>
+      </w:r>
+      <w:r>
+        <w:t xml:space="preserve">, the cognitive system generates the localized 1st-person perspective (</w:t>
+      </w:r>
+      <w:r>
+        <w:rPr>
+          <w:i/>
+          <w:iCs/>
+        </w:rPr>
+        <w:t xml:space="preserve">„I am here inside this body“</w:t>
+      </w:r>
+      <w:r>
+        <w:t xml:space="preserve">).</w:t>
+      </w:r>
+    </w:p>
+    <w:p>
+      <w:r>
+        <w:pict>
+          <v:rect style="width:0;height:1.5pt" o:hralign="center" o:hrstd="t" o:hr="t"/>
+        </w:pict>
+      </w:r>
+    </w:p>
+    <w:bookmarkEnd w:id="62"/>
+    <w:bookmarkStart w:id="63" w:name="Xe8af632bf88c104d446d3510268ae6973a36e85"/>
+    <w:p>
+      <w:pPr>
+        <w:pStyle w:val="Heading3"/>
+      </w:pPr>
+      <w:r>
+        <w:t xml:space="preserve">5. CIF Synthesis: Active Inference as the Engine of The Will to Exist</w:t>
+      </w:r>
+    </w:p>
+    <w:p>
+      <w:pPr>
+        <w:pStyle w:val="FirstParagraph"/>
+      </w:pPr>
+      <w:r>
+        <w:t xml:space="preserve">Within the Conative-Integrative Framework (CIF), Active Inference is not merely a biological algorithm—it is</w:t>
+      </w:r>
+      <w:r>
+        <w:t xml:space="preserve"> </w:t>
+      </w:r>
+      <w:r>
+        <w:rPr>
+          <w:b/>
+          <w:bCs/>
+        </w:rPr>
+        <w:t xml:space="preserve">the formal computational mechanics of the 6th Axiom (</w:t>
+      </w:r>
+      <w:r>
+        <w:rPr>
+          <w:b/>
+          <w:bCs/>
+          <w:i/>
+          <w:iCs/>
+        </w:rPr>
+        <w:t xml:space="preserve">The Will to Exist</w:t>
+      </w:r>
+      <w:r>
+        <w:rPr>
+          <w:b/>
+          <w:bCs/>
+        </w:rPr>
+        <w:t xml:space="preserve">)</w:t>
+      </w:r>
+      <w:r>
+        <w:t xml:space="preserve">:</w:t>
+      </w:r>
+    </w:p>
+    <w:p>
+      <w:pPr>
+        <w:pStyle w:val="BodyText"/>
+      </w:pPr>
+      <m:oMathPara>
+        <m:oMathParaPr>
+          <m:jc m:val="center"/>
+        </m:oMathParaPr>
+        <m:oMath>
+          <m:sSup>
+            <m:e>
+              <m:r>
+                <m:t>π</m:t>
+              </m:r>
+            </m:e>
+            <m:sup>
+              <m:r>
+                <m:rPr>
+                  <m:sty m:val="p"/>
+                </m:rPr>
+                <m:t>*</m:t>
+              </m:r>
+            </m:sup>
+          </m:sSup>
+          <m:r>
+            <m:rPr>
+              <m:sty m:val="p"/>
+            </m:rPr>
+            <m:t>=</m:t>
+          </m:r>
+          <m:r>
+            <m:rPr>
+              <m:sty m:val="p"/>
+            </m:rPr>
+            <m:t>arg</m:t>
+          </m:r>
+          <m:limLow>
+            <m:e>
+              <m:r>
+                <m:rPr>
+                  <m:sty m:val="p"/>
+                </m:rPr>
+                <m:t>min</m:t>
+              </m:r>
+            </m:e>
+            <m:lim>
+              <m:r>
+                <m:t>π</m:t>
+              </m:r>
+            </m:lim>
+          </m:limLow>
+          <m:nary>
+            <m:naryPr>
+              <m:chr m:val="∑"/>
+              <m:limLoc m:val="undOvr"/>
+              <m:subHide m:val="off"/>
+              <m:supHide m:val="on"/>
+            </m:naryPr>
+            <m:sub>
+              <m:r>
+                <m:t>τ</m:t>
+              </m:r>
+            </m:sub>
+            <m:sup>
+              <m:r>
+                <m:t>​</m:t>
+              </m:r>
+            </m:sup>
+            <m:e>
+              <m:r>
+                <m:rPr>
+                  <m:sty m:val="b"/>
+                </m:rPr>
+                <m:t>G</m:t>
+              </m:r>
+            </m:e>
+          </m:nary>
+          <m:r>
+            <m:rPr>
+              <m:sty m:val="p"/>
+            </m:rPr>
+            <m:t>(</m:t>
+          </m:r>
+          <m:r>
+            <m:t>π</m:t>
+          </m:r>
+          <m:r>
+            <m:rPr>
+              <m:sty m:val="p"/>
+            </m:rPr>
+            <m:t>,</m:t>
+          </m:r>
+          <m:r>
+            <m:t>τ</m:t>
+          </m:r>
+          <m:r>
+            <m:rPr>
+              <m:sty m:val="p"/>
+            </m:rPr>
+            <m:t>)</m:t>
+          </m:r>
+          <m:r>
+            <m:t> </m:t>
+          </m:r>
+          <m:r>
+            <m:rPr>
+              <m:sty m:val="p"/>
+            </m:rPr>
+            <m:t>⇔</m:t>
+          </m:r>
+          <m:r>
+            <m:t> </m:t>
+          </m:r>
+          <m:r>
+            <m:rPr>
+              <m:scr m:val="double-struck"/>
+              <m:sty m:val="p"/>
+            </m:rPr>
+            <m:t>E</m:t>
+          </m:r>
+          <m:d>
+            <m:dPr>
+              <m:begChr m:val="["/>
+              <m:sepChr m:val=""/>
+              <m:endChr m:val="]"/>
+              <m:grow/>
+            </m:dPr>
+            <m:e>
+              <m:r>
+                <m:rPr>
+                  <m:sty m:val="p"/>
+                </m:rPr>
+                <m:t>Φ</m:t>
+              </m:r>
+              <m:r>
+                <m:rPr>
+                  <m:sty m:val="p"/>
+                </m:rPr>
+                <m:t>(</m:t>
+              </m:r>
+              <m:r>
+                <m:t>t</m:t>
+              </m:r>
+              <m:r>
+                <m:rPr>
+                  <m:sty m:val="p"/>
+                </m:rPr>
+                <m:t>+</m:t>
+              </m:r>
+              <m:r>
+                <m:t>1</m:t>
+              </m:r>
+              <m:r>
+                <m:rPr>
+                  <m:sty m:val="p"/>
+                </m:rPr>
+                <m:t>)</m:t>
+              </m:r>
+              <m:r>
+                <m:rPr>
+                  <m:sty m:val="p"/>
+                </m:rPr>
+                <m:t>∣</m:t>
+              </m:r>
+              <m:sSup>
+                <m:e>
+                  <m:r>
+                    <m:t>π</m:t>
+                  </m:r>
+                </m:e>
+                <m:sup>
+                  <m:r>
+                    <m:rPr>
+                      <m:sty m:val="p"/>
+                    </m:rPr>
+                    <m:t>*</m:t>
+                  </m:r>
+                </m:sup>
+              </m:sSup>
+            </m:e>
+          </m:d>
+          <m:r>
+            <m:rPr>
+              <m:sty m:val="p"/>
+            </m:rPr>
+            <m:t>≥</m:t>
+          </m:r>
+          <m:r>
+            <m:rPr>
+              <m:sty m:val="p"/>
+            </m:rPr>
+            <m:t>Φ</m:t>
+          </m:r>
+          <m:r>
+            <m:rPr>
+              <m:sty m:val="p"/>
+            </m:rPr>
+            <m:t>(</m:t>
+          </m:r>
+          <m:r>
+            <m:t>t</m:t>
+          </m:r>
+          <m:r>
+            <m:rPr>
+              <m:sty m:val="p"/>
+            </m:rPr>
+            <m:t>)</m:t>
+          </m:r>
+        </m:oMath>
+      </m:oMathPara>
+    </w:p>
+    <w:p>
+      <w:pPr>
+        <w:pStyle w:val="FirstParagraph"/>
+      </w:pPr>
+      <w:r>
+        <w:t xml:space="preserve">An individual soul is an autopoietic informational whirlpool that continuously acts upon reality to preserve its own causal integration (</w:t>
+      </w:r>
+      <m:oMath>
+        <m:r>
+          <m:rPr>
+            <m:sty m:val="p"/>
+          </m:rPr>
+          <m:t>Φ</m:t>
+        </m:r>
+        <m:r>
+          <m:rPr>
+            <m:sty m:val="p"/>
+          </m:rPr>
+          <m:t>&gt;</m:t>
+        </m:r>
+        <m:r>
+          <m:t>0</m:t>
+        </m:r>
+      </m:oMath>
+      <w:r>
+        <w:t xml:space="preserve">) against entropy and dissolution.</w:t>
+      </w:r>
+    </w:p>
+    <w:p>
+      <w:r>
+        <w:pict>
+          <v:rect style="width:0;height:1.5pt" o:hralign="center" o:hrstd="t" o:hr="t"/>
+        </w:pict>
+      </w:r>
+    </w:p>
+    <w:bookmarkEnd w:id="63"/>
+    <w:bookmarkEnd w:id="64"/>
+    <w:bookmarkStart w:id="65" w:name="references-academic-bibliography"/>
+    <w:p>
+      <w:pPr>
+        <w:pStyle w:val="Heading2"/>
+      </w:pPr>
+      <w:r>
+        <w:t xml:space="preserve">References &amp; Academic Bibliography</w:t>
       </w:r>
     </w:p>
     <w:p>
@@ -4567,7 +6791,7 @@
           <w:b/>
           <w:bCs/>
         </w:rPr>
-        <w:t xml:space="preserve">Jablonka, E., &amp; Lamb, M. J. (2014).</w:t>
+        <w:t xml:space="preserve">Friston, K., FitzGerald, T., Rigoli, F., Schwartenbeck, P., &amp; Pezzulo, G. (2017).</w:t>
       </w:r>
       <w:r>
         <w:t xml:space="preserve"> </w:t>
@@ -4577,13 +6801,13 @@
           <w:i/>
           <w:iCs/>
         </w:rPr>
-        <w:t xml:space="preserve">Evolution in Four Dimensions: Genetic, Epigenetic, Behavioral, and Symbolic Variation in the History of Life.</w:t>
-      </w:r>
-      <w:r>
-        <w:t xml:space="preserve"> </w:t>
-      </w:r>
-      <w:r>
-        <w:t xml:space="preserve">MIT Press.</w:t>
+        <w:t xml:space="preserve">Active Inference: A Process Theory.</w:t>
+      </w:r>
+      <w:r>
+        <w:t xml:space="preserve"> </w:t>
+      </w:r>
+      <w:r>
+        <w:t xml:space="preserve">Neural Computation, 29(1), 1–49.</w:t>
       </w:r>
     </w:p>
     <w:p>
@@ -4599,7 +6823,7 @@
           <w:b/>
           <w:bCs/>
         </w:rPr>
-        <w:t xml:space="preserve">Kastrup, B. (2019).</w:t>
+        <w:t xml:space="preserve">Jablonka, E., &amp; Lamb, M. J. (2014).</w:t>
       </w:r>
       <w:r>
         <w:t xml:space="preserve"> </w:t>
@@ -4609,13 +6833,13 @@
           <w:i/>
           <w:iCs/>
         </w:rPr>
-        <w:t xml:space="preserve">The Idea of the World: A Multi-Disciplinary Argument for the Mental Nature of Reality.</w:t>
-      </w:r>
-      <w:r>
-        <w:t xml:space="preserve"> </w:t>
-      </w:r>
-      <w:r>
-        <w:t xml:space="preserve">Iff Books.</w:t>
+        <w:t xml:space="preserve">Evolution in Four Dimensions: Genetic, Epigenetic, Behavioral, and Symbolic Variation in the History of Life.</w:t>
+      </w:r>
+      <w:r>
+        <w:t xml:space="preserve"> </w:t>
+      </w:r>
+      <w:r>
+        <w:t xml:space="preserve">MIT Press.</w:t>
       </w:r>
     </w:p>
     <w:p>
@@ -4631,7 +6855,7 @@
           <w:b/>
           <w:bCs/>
         </w:rPr>
-        <w:t xml:space="preserve">Kastrup, B. (2021).</w:t>
+        <w:t xml:space="preserve">Kastrup, B. (2019).</w:t>
       </w:r>
       <w:r>
         <w:t xml:space="preserve"> </w:t>
@@ -4641,7 +6865,7 @@
           <w:i/>
           <w:iCs/>
         </w:rPr>
-        <w:t xml:space="preserve">Science Ideated: The Fall of Matter and the Contours of the Next Mainstream Scientific Worldview.</w:t>
+        <w:t xml:space="preserve">The Idea of the World: A Multi-Disciplinary Argument for the Mental Nature of Reality.</w:t>
       </w:r>
       <w:r>
         <w:t xml:space="preserve"> </w:t>
@@ -4663,7 +6887,7 @@
           <w:b/>
           <w:bCs/>
         </w:rPr>
-        <w:t xml:space="preserve">Metzinger, T. (2003).</w:t>
+        <w:t xml:space="preserve">Kastrup, B. (2021).</w:t>
       </w:r>
       <w:r>
         <w:t xml:space="preserve"> </w:t>
@@ -4673,13 +6897,13 @@
           <w:i/>
           <w:iCs/>
         </w:rPr>
-        <w:t xml:space="preserve">Being No One: The Self-Model Theory of Subjectivity.</w:t>
-      </w:r>
-      <w:r>
-        <w:t xml:space="preserve"> </w:t>
-      </w:r>
-      <w:r>
-        <w:t xml:space="preserve">MIT Press.</w:t>
+        <w:t xml:space="preserve">Science Ideated: The Fall of Matter and the Contours of the Next Mainstream Scientific Worldview.</w:t>
+      </w:r>
+      <w:r>
+        <w:t xml:space="preserve"> </w:t>
+      </w:r>
+      <w:r>
+        <w:t xml:space="preserve">Iff Books.</w:t>
       </w:r>
     </w:p>
     <w:p>
@@ -4695,7 +6919,7 @@
           <w:b/>
           <w:bCs/>
         </w:rPr>
-        <w:t xml:space="preserve">Metzinger, T. (2009).</w:t>
+        <w:t xml:space="preserve">Metzinger, T. (2003).</w:t>
       </w:r>
       <w:r>
         <w:t xml:space="preserve"> </w:t>
@@ -4705,13 +6929,13 @@
           <w:i/>
           <w:iCs/>
         </w:rPr>
-        <w:t xml:space="preserve">The Ego Tunnel: The Science of the Mind and the Myth of the Self.</w:t>
-      </w:r>
-      <w:r>
-        <w:t xml:space="preserve"> </w:t>
-      </w:r>
-      <w:r>
-        <w:t xml:space="preserve">Basic Books.</w:t>
+        <w:t xml:space="preserve">Being No One: The Self-Model Theory of Subjectivity.</w:t>
+      </w:r>
+      <w:r>
+        <w:t xml:space="preserve"> </w:t>
+      </w:r>
+      <w:r>
+        <w:t xml:space="preserve">MIT Press.</w:t>
       </w:r>
     </w:p>
     <w:p>
@@ -4727,7 +6951,7 @@
           <w:b/>
           <w:bCs/>
         </w:rPr>
-        <w:t xml:space="preserve">Metzinger, T. (2024).</w:t>
+        <w:t xml:space="preserve">Metzinger, T. (2009).</w:t>
       </w:r>
       <w:r>
         <w:t xml:space="preserve"> </w:t>
@@ -4737,13 +6961,13 @@
           <w:i/>
           <w:iCs/>
         </w:rPr>
-        <w:t xml:space="preserve">The Elephant and the Blind: The Experience of Pure Consciousness: Philosophy, Science, and 500+ Experiential Reports.</w:t>
-      </w:r>
-      <w:r>
-        <w:t xml:space="preserve"> </w:t>
-      </w:r>
-      <w:r>
-        <w:t xml:space="preserve">MIT Press.</w:t>
+        <w:t xml:space="preserve">The Ego Tunnel: The Science of the Mind and the Myth of the Self.</w:t>
+      </w:r>
+      <w:r>
+        <w:t xml:space="preserve"> </w:t>
+      </w:r>
+      <w:r>
+        <w:t xml:space="preserve">Basic Books.</w:t>
       </w:r>
     </w:p>
     <w:p>
@@ -4759,7 +6983,7 @@
           <w:b/>
           <w:bCs/>
         </w:rPr>
-        <w:t xml:space="preserve">Monod, J. (1970).</w:t>
+        <w:t xml:space="preserve">Metzinger, T. (2024).</w:t>
       </w:r>
       <w:r>
         <w:t xml:space="preserve"> </w:t>
@@ -4769,13 +6993,13 @@
           <w:i/>
           <w:iCs/>
         </w:rPr>
-        <w:t xml:space="preserve">Le Hasard et la Nécessité: Essai sur la philosophie naturelle de la biologie moderne (Chance and Necessity).</w:t>
-      </w:r>
-      <w:r>
-        <w:t xml:space="preserve"> </w:t>
-      </w:r>
-      <w:r>
-        <w:t xml:space="preserve">Éditions du Seuil, Paris. (Nobel laureate formulation of blind genetic chance and invariant teleonomic necessity).</w:t>
+        <w:t xml:space="preserve">The Elephant and the Blind: The Experience of Pure Consciousness: Philosophy, Science, and 500+ Experiential Reports.</w:t>
+      </w:r>
+      <w:r>
+        <w:t xml:space="preserve"> </w:t>
+      </w:r>
+      <w:r>
+        <w:t xml:space="preserve">MIT Press.</w:t>
       </w:r>
     </w:p>
     <w:p>
@@ -4791,7 +7015,7 @@
           <w:b/>
           <w:bCs/>
         </w:rPr>
-        <w:t xml:space="preserve">Panksepp, J. (1998).</w:t>
+        <w:t xml:space="preserve">Monod, J. (1970).</w:t>
       </w:r>
       <w:r>
         <w:t xml:space="preserve"> </w:t>
@@ -4801,6 +7025,38 @@
           <w:i/>
           <w:iCs/>
         </w:rPr>
+        <w:t xml:space="preserve">Le Hasard et la Nécessité: Essai sur la philosophie naturelle de la biologie moderne (Chance and Necessity).</w:t>
+      </w:r>
+      <w:r>
+        <w:t xml:space="preserve"> </w:t>
+      </w:r>
+      <w:r>
+        <w:t xml:space="preserve">Éditions du Seuil, Paris. (Nobel laureate formulation of blind genetic chance and invariant teleonomic necessity).</w:t>
+      </w:r>
+    </w:p>
+    <w:p>
+      <w:pPr>
+        <w:pStyle w:val="Compact"/>
+        <w:numPr>
+          <w:ilvl w:val="0"/>
+          <w:numId w:val="1013"/>
+        </w:numPr>
+      </w:pPr>
+      <w:r>
+        <w:rPr>
+          <w:b/>
+          <w:bCs/>
+        </w:rPr>
+        <w:t xml:space="preserve">Panksepp, J. (1998).</w:t>
+      </w:r>
+      <w:r>
+        <w:t xml:space="preserve"> </w:t>
+      </w:r>
+      <w:r>
+        <w:rPr>
+          <w:i/>
+          <w:iCs/>
+        </w:rPr>
         <w:t xml:space="preserve">Affective Neuroscience: The Foundations of Human and Animal Emotions.</w:t>
       </w:r>
       <w:r>
@@ -4808,6 +7064,38 @@
       </w:r>
       <w:r>
         <w:t xml:space="preserve">Oxford University Press.</w:t>
+      </w:r>
+    </w:p>
+    <w:p>
+      <w:pPr>
+        <w:pStyle w:val="Compact"/>
+        <w:numPr>
+          <w:ilvl w:val="0"/>
+          <w:numId w:val="1013"/>
+        </w:numPr>
+      </w:pPr>
+      <w:r>
+        <w:rPr>
+          <w:b/>
+          <w:bCs/>
+        </w:rPr>
+        <w:t xml:space="preserve">Parr, T., Pezzulo, G., &amp; Friston, K. J. (2022).</w:t>
+      </w:r>
+      <w:r>
+        <w:t xml:space="preserve"> </w:t>
+      </w:r>
+      <w:r>
+        <w:rPr>
+          <w:i/>
+          <w:iCs/>
+        </w:rPr>
+        <w:t xml:space="preserve">Active Inference: The Free Energy Principle in Mind, Brain, and Behavior.</w:t>
+      </w:r>
+      <w:r>
+        <w:t xml:space="preserve"> </w:t>
+      </w:r>
+      <w:r>
+        <w:t xml:space="preserve">MIT Press.</w:t>
       </w:r>
     </w:p>
     <w:p>
@@ -5120,14 +7408,14 @@
         </w:pict>
       </w:r>
     </w:p>
-    <w:bookmarkEnd w:id="56"/>
-    <w:bookmarkStart w:id="61" w:name="tool-attribution-colophon"/>
+    <w:bookmarkEnd w:id="65"/>
+    <w:bookmarkStart w:id="70" w:name="tool-attribution-colophon"/>
     <w:p>
       <w:pPr>
         <w:pStyle w:val="Heading2"/>
       </w:pPr>
       <w:r>
-        <w:t xml:space="preserve">10. Tool Attribution &amp; Colophon</w:t>
+        <w:t xml:space="preserve">Tool Attribution &amp; Colophon</w:t>
       </w:r>
     </w:p>
     <w:p>
@@ -5224,7 +7512,7 @@
         </w:pict>
       </w:r>
     </w:p>
-    <w:bookmarkStart w:id="60" w:name="vault-repository-references"/>
+    <w:bookmarkStart w:id="69" w:name="vault-repository-references"/>
     <w:p>
       <w:pPr>
         <w:pStyle w:val="Heading3"/>
@@ -5251,7 +7539,7 @@
       <w:r>
         <w:t xml:space="preserve"> </w:t>
       </w:r>
-      <w:hyperlink r:id="rId57">
+      <w:hyperlink r:id="rId66">
         <w:r>
           <w:rPr>
             <w:rStyle w:val="VerbatimChar"/>
@@ -5278,7 +7566,7 @@
       <w:r>
         <w:t xml:space="preserve"> </w:t>
       </w:r>
-      <w:hyperlink r:id="rId58">
+      <w:hyperlink r:id="rId67">
         <w:r>
           <w:rPr>
             <w:rStyle w:val="VerbatimChar"/>
@@ -5305,7 +7593,7 @@
       <w:r>
         <w:t xml:space="preserve"> </w:t>
       </w:r>
-      <w:hyperlink r:id="rId59">
+      <w:hyperlink r:id="rId68">
         <w:r>
           <w:rPr>
             <w:rStyle w:val="VerbatimChar"/>
@@ -5314,9 +7602,9 @@
         </w:r>
       </w:hyperlink>
     </w:p>
-    <w:bookmarkEnd w:id="60"/>
-    <w:bookmarkEnd w:id="61"/>
-    <w:bookmarkEnd w:id="62"/>
+    <w:bookmarkEnd w:id="69"/>
+    <w:bookmarkEnd w:id="70"/>
+    <w:bookmarkEnd w:id="71"/>
     <w:sectPr>
       <w:footnotePr>
         <w:numRestart w:val="eachSect"/>

</xml_diff>